<commit_message>
Fix PPOIS report formatting and diagrams
</commit_message>
<xml_diff>
--- a/4/ППОИС/ППОИС_10_АлбахтинИВ.docx
+++ b/4/ППОИС/ППОИС_10_АлбахтинИВ.docx
@@ -49,7 +49,7 @@
                 <w14:ligatures w14:val="none"/>
               </w:rPr>
               <w:drawing>
-                <wp:inline distT="0" distB="0" distL="0" distR="0" wp14:anchorId="098CC79B" wp14:editId="78D22CF1">
+                <wp:inline distT="0" distB="0" distL="0" distR="0" wp14:anchorId="42F747B5" wp14:editId="2386D42E">
                   <wp:extent cx="1066800" cy="1066800"/>
                   <wp:effectExtent l="0" t="0" r="0" b="0"/>
                   <wp:docPr id="298370851" name="Рисунок 3"/>
@@ -259,7 +259,7 @@
               <mc:AlternateContent>
                 <mc:Choice Requires="wps">
                   <w:drawing>
-                    <wp:inline distT="0" distB="0" distL="0" distR="0" wp14:anchorId="32131D20" wp14:editId="22512CF8">
+                    <wp:inline distT="0" distB="0" distL="0" distR="0" wp14:anchorId="0686B1FF" wp14:editId="78672979">
                       <wp:extent cx="5600700" cy="1270"/>
                       <wp:effectExtent l="19050" t="19050" r="19050" b="27305"/>
                       <wp:docPr id="2" name="Прямая соединительная линия 2"/>
@@ -1123,7 +1123,7 @@
       <w:r>
         <w:fldChar w:fldCharType="separate"/>
       </w:r>
-      <w:hyperlink w:anchor="_Toc242317313" w:history="1">
+      <w:hyperlink w:anchor="_Toc244141432" w:history="1">
         <w:r>
           <w:rPr>
             <w:rStyle w:val="a4"/>
@@ -1150,7 +1150,7 @@
             <w:noProof/>
             <w:webHidden/>
           </w:rPr>
-          <w:instrText xml:space="preserve"> PAGEREF _Toc242317313 \h </w:instrText>
+          <w:instrText xml:space="preserve"> PAGEREF _Toc244141432 \h </w:instrText>
         </w:r>
         <w:r>
           <w:rPr>
@@ -1194,7 +1194,7 @@
           <w14:ligatures w14:val="none"/>
         </w:rPr>
       </w:pPr>
-      <w:hyperlink w:anchor="_Toc242317314" w:history="1">
+      <w:hyperlink w:anchor="_Toc244141433" w:history="1">
         <w:r>
           <w:rPr>
             <w:rStyle w:val="a4"/>
@@ -1221,7 +1221,7 @@
             <w:noProof/>
             <w:webHidden/>
           </w:rPr>
-          <w:instrText xml:space="preserve"> PAGEREF _Toc242317314 \h </w:instrText>
+          <w:instrText xml:space="preserve"> PAGEREF _Toc244141433 \h </w:instrText>
         </w:r>
         <w:r>
           <w:rPr>
@@ -1265,7 +1265,7 @@
           <w14:ligatures w14:val="none"/>
         </w:rPr>
       </w:pPr>
-      <w:hyperlink w:anchor="_Toc242317315" w:history="1">
+      <w:hyperlink w:anchor="_Toc244141434" w:history="1">
         <w:r>
           <w:rPr>
             <w:rStyle w:val="a4"/>
@@ -1292,7 +1292,7 @@
             <w:noProof/>
             <w:webHidden/>
           </w:rPr>
-          <w:instrText xml:space="preserve"> PAGEREF _Toc242317315 \h </w:instrText>
+          <w:instrText xml:space="preserve"> PAGEREF _Toc244141434 \h </w:instrText>
         </w:r>
         <w:r>
           <w:rPr>
@@ -1336,7 +1336,7 @@
           <w14:ligatures w14:val="none"/>
         </w:rPr>
       </w:pPr>
-      <w:hyperlink w:anchor="_Toc242317316" w:history="1">
+      <w:hyperlink w:anchor="_Toc244141435" w:history="1">
         <w:r>
           <w:rPr>
             <w:rStyle w:val="a4"/>
@@ -1363,7 +1363,7 @@
             <w:noProof/>
             <w:webHidden/>
           </w:rPr>
-          <w:instrText xml:space="preserve"> PAGEREF _Toc242317316 \h </w:instrText>
+          <w:instrText xml:space="preserve"> PAGEREF _Toc244141435 \h </w:instrText>
         </w:r>
         <w:r>
           <w:rPr>
@@ -1407,7 +1407,7 @@
           <w14:ligatures w14:val="none"/>
         </w:rPr>
       </w:pPr>
-      <w:hyperlink w:anchor="_Toc242317317" w:history="1">
+      <w:hyperlink w:anchor="_Toc244141436" w:history="1">
         <w:r>
           <w:rPr>
             <w:rStyle w:val="a4"/>
@@ -1434,7 +1434,7 @@
             <w:noProof/>
             <w:webHidden/>
           </w:rPr>
-          <w:instrText xml:space="preserve"> PAGEREF _Toc242317317 \h </w:instrText>
+          <w:instrText xml:space="preserve"> PAGEREF _Toc244141436 \h </w:instrText>
         </w:r>
         <w:r>
           <w:rPr>
@@ -1478,7 +1478,7 @@
           <w14:ligatures w14:val="none"/>
         </w:rPr>
       </w:pPr>
-      <w:hyperlink w:anchor="_Toc242317318" w:history="1">
+      <w:hyperlink w:anchor="_Toc244141437" w:history="1">
         <w:r>
           <w:rPr>
             <w:rStyle w:val="a4"/>
@@ -1505,7 +1505,7 @@
             <w:noProof/>
             <w:webHidden/>
           </w:rPr>
-          <w:instrText xml:space="preserve"> PAGEREF _Toc242317318 \h </w:instrText>
+          <w:instrText xml:space="preserve"> PAGEREF _Toc244141437 \h </w:instrText>
         </w:r>
         <w:r>
           <w:rPr>
@@ -1549,7 +1549,7 @@
           <w14:ligatures w14:val="none"/>
         </w:rPr>
       </w:pPr>
-      <w:hyperlink w:anchor="_Toc242317319" w:history="1">
+      <w:hyperlink w:anchor="_Toc244141438" w:history="1">
         <w:r>
           <w:rPr>
             <w:rStyle w:val="a4"/>
@@ -1576,7 +1576,7 @@
             <w:noProof/>
             <w:webHidden/>
           </w:rPr>
-          <w:instrText xml:space="preserve"> PAGEREF _Toc242317319 \h </w:instrText>
+          <w:instrText xml:space="preserve"> PAGEREF _Toc244141438 \h </w:instrText>
         </w:r>
         <w:r>
           <w:rPr>
@@ -1620,7 +1620,7 @@
           <w14:ligatures w14:val="none"/>
         </w:rPr>
       </w:pPr>
-      <w:hyperlink w:anchor="_Toc242317320" w:history="1">
+      <w:hyperlink w:anchor="_Toc244141439" w:history="1">
         <w:r>
           <w:rPr>
             <w:rStyle w:val="a4"/>
@@ -1647,7 +1647,7 @@
             <w:noProof/>
             <w:webHidden/>
           </w:rPr>
-          <w:instrText xml:space="preserve"> PAGEREF _Toc242317320 \h </w:instrText>
+          <w:instrText xml:space="preserve"> PAGEREF _Toc244141439 \h </w:instrText>
         </w:r>
         <w:r>
           <w:rPr>
@@ -1691,7 +1691,7 @@
           <w14:ligatures w14:val="none"/>
         </w:rPr>
       </w:pPr>
-      <w:hyperlink w:anchor="_Toc242317321" w:history="1">
+      <w:hyperlink w:anchor="_Toc244141440" w:history="1">
         <w:r>
           <w:rPr>
             <w:rStyle w:val="a4"/>
@@ -1718,7 +1718,7 @@
             <w:noProof/>
             <w:webHidden/>
           </w:rPr>
-          <w:instrText xml:space="preserve"> PAGEREF _Toc242317321 \h </w:instrText>
+          <w:instrText xml:space="preserve"> PAGEREF _Toc244141440 \h </w:instrText>
         </w:r>
         <w:r>
           <w:rPr>
@@ -1762,7 +1762,7 @@
           <w14:ligatures w14:val="none"/>
         </w:rPr>
       </w:pPr>
-      <w:hyperlink w:anchor="_Toc242317322" w:history="1">
+      <w:hyperlink w:anchor="_Toc244141441" w:history="1">
         <w:r>
           <w:rPr>
             <w:rStyle w:val="a4"/>
@@ -1789,7 +1789,7 @@
             <w:noProof/>
             <w:webHidden/>
           </w:rPr>
-          <w:instrText xml:space="preserve"> PAGEREF _Toc242317322 \h </w:instrText>
+          <w:instrText xml:space="preserve"> PAGEREF _Toc244141441 \h </w:instrText>
         </w:r>
         <w:r>
           <w:rPr>
@@ -1833,7 +1833,7 @@
           <w14:ligatures w14:val="none"/>
         </w:rPr>
       </w:pPr>
-      <w:hyperlink w:anchor="_Toc242317323" w:history="1">
+      <w:hyperlink w:anchor="_Toc244141442" w:history="1">
         <w:r>
           <w:rPr>
             <w:rStyle w:val="a4"/>
@@ -1860,7 +1860,7 @@
             <w:noProof/>
             <w:webHidden/>
           </w:rPr>
-          <w:instrText xml:space="preserve"> PAGEREF _Toc242317323 \h </w:instrText>
+          <w:instrText xml:space="preserve"> PAGEREF _Toc244141442 \h </w:instrText>
         </w:r>
         <w:r>
           <w:rPr>
@@ -1904,7 +1904,7 @@
           <w14:ligatures w14:val="none"/>
         </w:rPr>
       </w:pPr>
-      <w:hyperlink w:anchor="_Toc242317324" w:history="1">
+      <w:hyperlink w:anchor="_Toc244141443" w:history="1">
         <w:r>
           <w:rPr>
             <w:rStyle w:val="a4"/>
@@ -1931,7 +1931,7 @@
             <w:noProof/>
             <w:webHidden/>
           </w:rPr>
-          <w:instrText xml:space="preserve"> PAGEREF _Toc242317324 \h </w:instrText>
+          <w:instrText xml:space="preserve"> PAGEREF _Toc244141443 \h </w:instrText>
         </w:r>
         <w:r>
           <w:rPr>
@@ -1975,7 +1975,7 @@
           <w14:ligatures w14:val="none"/>
         </w:rPr>
       </w:pPr>
-      <w:hyperlink w:anchor="_Toc242317325" w:history="1">
+      <w:hyperlink w:anchor="_Toc244141444" w:history="1">
         <w:r>
           <w:rPr>
             <w:rStyle w:val="a4"/>
@@ -2002,7 +2002,7 @@
             <w:noProof/>
             <w:webHidden/>
           </w:rPr>
-          <w:instrText xml:space="preserve"> PAGEREF _Toc242317325 \h </w:instrText>
+          <w:instrText xml:space="preserve"> PAGEREF _Toc244141444 \h </w:instrText>
         </w:r>
         <w:r>
           <w:rPr>
@@ -2046,7 +2046,7 @@
           <w14:ligatures w14:val="none"/>
         </w:rPr>
       </w:pPr>
-      <w:hyperlink w:anchor="_Toc242317326" w:history="1">
+      <w:hyperlink w:anchor="_Toc244141445" w:history="1">
         <w:r>
           <w:rPr>
             <w:rStyle w:val="a4"/>
@@ -2073,7 +2073,7 @@
             <w:noProof/>
             <w:webHidden/>
           </w:rPr>
-          <w:instrText xml:space="preserve"> PAGEREF _Toc242317326 \h </w:instrText>
+          <w:instrText xml:space="preserve"> PAGEREF _Toc244141445 \h </w:instrText>
         </w:r>
         <w:r>
           <w:rPr>
@@ -2117,7 +2117,7 @@
           <w14:ligatures w14:val="none"/>
         </w:rPr>
       </w:pPr>
-      <w:hyperlink w:anchor="_Toc242317327" w:history="1">
+      <w:hyperlink w:anchor="_Toc244141446" w:history="1">
         <w:r>
           <w:rPr>
             <w:rStyle w:val="a4"/>
@@ -2144,7 +2144,7 @@
             <w:noProof/>
             <w:webHidden/>
           </w:rPr>
-          <w:instrText xml:space="preserve"> PAGEREF _Toc242317327 \h </w:instrText>
+          <w:instrText xml:space="preserve"> PAGEREF _Toc244141446 \h </w:instrText>
         </w:r>
         <w:r>
           <w:rPr>
@@ -2188,7 +2188,7 @@
           <w14:ligatures w14:val="none"/>
         </w:rPr>
       </w:pPr>
-      <w:hyperlink w:anchor="_Toc242317328" w:history="1">
+      <w:hyperlink w:anchor="_Toc244141447" w:history="1">
         <w:r>
           <w:rPr>
             <w:rStyle w:val="a4"/>
@@ -2215,7 +2215,7 @@
             <w:noProof/>
             <w:webHidden/>
           </w:rPr>
-          <w:instrText xml:space="preserve"> PAGEREF _Toc242317328 \h </w:instrText>
+          <w:instrText xml:space="preserve"> PAGEREF _Toc244141447 \h </w:instrText>
         </w:r>
         <w:r>
           <w:rPr>
@@ -2259,7 +2259,7 @@
           <w14:ligatures w14:val="none"/>
         </w:rPr>
       </w:pPr>
-      <w:hyperlink w:anchor="_Toc242317329" w:history="1">
+      <w:hyperlink w:anchor="_Toc244141448" w:history="1">
         <w:r>
           <w:rPr>
             <w:rStyle w:val="a4"/>
@@ -2286,7 +2286,7 @@
             <w:noProof/>
             <w:webHidden/>
           </w:rPr>
-          <w:instrText xml:space="preserve"> PAGEREF _Toc242317329 \h </w:instrText>
+          <w:instrText xml:space="preserve"> PAGEREF _Toc244141448 \h </w:instrText>
         </w:r>
         <w:r>
           <w:rPr>
@@ -2330,7 +2330,7 @@
           <w14:ligatures w14:val="none"/>
         </w:rPr>
       </w:pPr>
-      <w:hyperlink w:anchor="_Toc242317330" w:history="1">
+      <w:hyperlink w:anchor="_Toc244141449" w:history="1">
         <w:r>
           <w:rPr>
             <w:rStyle w:val="a4"/>
@@ -2357,7 +2357,7 @@
             <w:noProof/>
             <w:webHidden/>
           </w:rPr>
-          <w:instrText xml:space="preserve"> PAGEREF _Toc242317330 \h </w:instrText>
+          <w:instrText xml:space="preserve"> PAGEREF _Toc244141449 \h </w:instrText>
         </w:r>
         <w:r>
           <w:rPr>
@@ -2401,7 +2401,7 @@
           <w14:ligatures w14:val="none"/>
         </w:rPr>
       </w:pPr>
-      <w:hyperlink w:anchor="_Toc242317331" w:history="1">
+      <w:hyperlink w:anchor="_Toc244141450" w:history="1">
         <w:r>
           <w:rPr>
             <w:rStyle w:val="a4"/>
@@ -2428,7 +2428,7 @@
             <w:noProof/>
             <w:webHidden/>
           </w:rPr>
-          <w:instrText xml:space="preserve"> PAGEREF _Toc242317331 \h </w:instrText>
+          <w:instrText xml:space="preserve"> PAGEREF _Toc244141450 \h </w:instrText>
         </w:r>
         <w:r>
           <w:rPr>
@@ -2472,7 +2472,7 @@
           <w14:ligatures w14:val="none"/>
         </w:rPr>
       </w:pPr>
-      <w:hyperlink w:anchor="_Toc242317332" w:history="1">
+      <w:hyperlink w:anchor="_Toc244141451" w:history="1">
         <w:r>
           <w:rPr>
             <w:rStyle w:val="a4"/>
@@ -2499,7 +2499,7 @@
             <w:noProof/>
             <w:webHidden/>
           </w:rPr>
-          <w:instrText xml:space="preserve"> PAGEREF _Toc242317332 \h </w:instrText>
+          <w:instrText xml:space="preserve"> PAGEREF _Toc244141451 \h </w:instrText>
         </w:r>
         <w:r>
           <w:rPr>
@@ -2543,7 +2543,7 @@
           <w14:ligatures w14:val="none"/>
         </w:rPr>
       </w:pPr>
-      <w:hyperlink w:anchor="_Toc242317333" w:history="1">
+      <w:hyperlink w:anchor="_Toc244141452" w:history="1">
         <w:r>
           <w:rPr>
             <w:rStyle w:val="a4"/>
@@ -2570,7 +2570,7 @@
             <w:noProof/>
             <w:webHidden/>
           </w:rPr>
-          <w:instrText xml:space="preserve"> PAGEREF _Toc242317333 \h </w:instrText>
+          <w:instrText xml:space="preserve"> PAGEREF _Toc244141452 \h </w:instrText>
         </w:r>
         <w:r>
           <w:rPr>
@@ -2614,7 +2614,7 @@
           <w14:ligatures w14:val="none"/>
         </w:rPr>
       </w:pPr>
-      <w:hyperlink w:anchor="_Toc242317334" w:history="1">
+      <w:hyperlink w:anchor="_Toc244141453" w:history="1">
         <w:r>
           <w:rPr>
             <w:rStyle w:val="a4"/>
@@ -2641,7 +2641,7 @@
             <w:noProof/>
             <w:webHidden/>
           </w:rPr>
-          <w:instrText xml:space="preserve"> PAGEREF _Toc242317334 \h </w:instrText>
+          <w:instrText xml:space="preserve"> PAGEREF _Toc244141453 \h </w:instrText>
         </w:r>
         <w:r>
           <w:rPr>
@@ -2661,7 +2661,7 @@
             <w:noProof/>
             <w:webHidden/>
           </w:rPr>
-          <w:t>20</w:t>
+          <w:t>19</w:t>
         </w:r>
         <w:r>
           <w:rPr>
@@ -2685,7 +2685,7 @@
           <w14:ligatures w14:val="none"/>
         </w:rPr>
       </w:pPr>
-      <w:hyperlink w:anchor="_Toc242317335" w:history="1">
+      <w:hyperlink w:anchor="_Toc244141454" w:history="1">
         <w:r>
           <w:rPr>
             <w:rStyle w:val="a4"/>
@@ -2712,7 +2712,7 @@
             <w:noProof/>
             <w:webHidden/>
           </w:rPr>
-          <w:instrText xml:space="preserve"> PAGEREF _Toc242317335 \h </w:instrText>
+          <w:instrText xml:space="preserve"> PAGEREF _Toc244141454 \h </w:instrText>
         </w:r>
         <w:r>
           <w:rPr>
@@ -2732,7 +2732,7 @@
             <w:noProof/>
             <w:webHidden/>
           </w:rPr>
-          <w:t>21</w:t>
+          <w:t>20</w:t>
         </w:r>
         <w:r>
           <w:rPr>
@@ -2756,7 +2756,7 @@
           <w14:ligatures w14:val="none"/>
         </w:rPr>
       </w:pPr>
-      <w:hyperlink w:anchor="_Toc242317336" w:history="1">
+      <w:hyperlink w:anchor="_Toc244141455" w:history="1">
         <w:r>
           <w:rPr>
             <w:rStyle w:val="a4"/>
@@ -2783,7 +2783,7 @@
             <w:noProof/>
             <w:webHidden/>
           </w:rPr>
-          <w:instrText xml:space="preserve"> PAGEREF _Toc242317336 \h </w:instrText>
+          <w:instrText xml:space="preserve"> PAGEREF _Toc244141455 \h </w:instrText>
         </w:r>
         <w:r>
           <w:rPr>
@@ -2827,7 +2827,7 @@
           <w14:ligatures w14:val="none"/>
         </w:rPr>
       </w:pPr>
-      <w:hyperlink w:anchor="_Toc242317337" w:history="1">
+      <w:hyperlink w:anchor="_Toc244141456" w:history="1">
         <w:r>
           <w:rPr>
             <w:rStyle w:val="a4"/>
@@ -2854,7 +2854,7 @@
             <w:noProof/>
             <w:webHidden/>
           </w:rPr>
-          <w:instrText xml:space="preserve"> PAGEREF _Toc242317337 \h </w:instrText>
+          <w:instrText xml:space="preserve"> PAGEREF _Toc244141456 \h </w:instrText>
         </w:r>
         <w:r>
           <w:rPr>
@@ -2898,7 +2898,7 @@
           <w14:ligatures w14:val="none"/>
         </w:rPr>
       </w:pPr>
-      <w:hyperlink w:anchor="_Toc242317338" w:history="1">
+      <w:hyperlink w:anchor="_Toc244141457" w:history="1">
         <w:r>
           <w:rPr>
             <w:rStyle w:val="a4"/>
@@ -2925,7 +2925,7 @@
             <w:noProof/>
             <w:webHidden/>
           </w:rPr>
-          <w:instrText xml:space="preserve"> PAGEREF _Toc242317338 \h </w:instrText>
+          <w:instrText xml:space="preserve"> PAGEREF _Toc244141457 \h </w:instrText>
         </w:r>
         <w:r>
           <w:rPr>
@@ -2969,7 +2969,7 @@
           <w14:ligatures w14:val="none"/>
         </w:rPr>
       </w:pPr>
-      <w:hyperlink w:anchor="_Toc242317339" w:history="1">
+      <w:hyperlink w:anchor="_Toc244141458" w:history="1">
         <w:r>
           <w:rPr>
             <w:rStyle w:val="a4"/>
@@ -2996,7 +2996,7 @@
             <w:noProof/>
             <w:webHidden/>
           </w:rPr>
-          <w:instrText xml:space="preserve"> PAGEREF _Toc242317339 \h </w:instrText>
+          <w:instrText xml:space="preserve"> PAGEREF _Toc244141458 \h </w:instrText>
         </w:r>
         <w:r>
           <w:rPr>
@@ -3040,7 +3040,7 @@
           <w14:ligatures w14:val="none"/>
         </w:rPr>
       </w:pPr>
-      <w:hyperlink w:anchor="_Toc242317340" w:history="1">
+      <w:hyperlink w:anchor="_Toc244141459" w:history="1">
         <w:r>
           <w:rPr>
             <w:rStyle w:val="a4"/>
@@ -3067,7 +3067,7 @@
             <w:noProof/>
             <w:webHidden/>
           </w:rPr>
-          <w:instrText xml:space="preserve"> PAGEREF _Toc242317340 \h </w:instrText>
+          <w:instrText xml:space="preserve"> PAGEREF _Toc244141459 \h </w:instrText>
         </w:r>
         <w:r>
           <w:rPr>
@@ -3111,7 +3111,7 @@
           <w14:ligatures w14:val="none"/>
         </w:rPr>
       </w:pPr>
-      <w:hyperlink w:anchor="_Toc242317341" w:history="1">
+      <w:hyperlink w:anchor="_Toc244141460" w:history="1">
         <w:r>
           <w:rPr>
             <w:rStyle w:val="a4"/>
@@ -3138,7 +3138,7 @@
             <w:noProof/>
             <w:webHidden/>
           </w:rPr>
-          <w:instrText xml:space="preserve"> PAGEREF _Toc242317341 \h </w:instrText>
+          <w:instrText xml:space="preserve"> PAGEREF _Toc244141460 \h </w:instrText>
         </w:r>
         <w:r>
           <w:rPr>
@@ -3158,7 +3158,7 @@
             <w:noProof/>
             <w:webHidden/>
           </w:rPr>
-          <w:t>26</w:t>
+          <w:t>25</w:t>
         </w:r>
         <w:r>
           <w:rPr>
@@ -3182,7 +3182,7 @@
           <w14:ligatures w14:val="none"/>
         </w:rPr>
       </w:pPr>
-      <w:hyperlink w:anchor="_Toc242317342" w:history="1">
+      <w:hyperlink w:anchor="_Toc244141461" w:history="1">
         <w:r>
           <w:rPr>
             <w:rStyle w:val="a4"/>
@@ -3209,7 +3209,7 @@
             <w:noProof/>
             <w:webHidden/>
           </w:rPr>
-          <w:instrText xml:space="preserve"> PAGEREF _Toc242317342 \h </w:instrText>
+          <w:instrText xml:space="preserve"> PAGEREF _Toc244141461 \h </w:instrText>
         </w:r>
         <w:r>
           <w:rPr>
@@ -3229,7 +3229,7 @@
             <w:noProof/>
             <w:webHidden/>
           </w:rPr>
-          <w:t>26</w:t>
+          <w:t>25</w:t>
         </w:r>
         <w:r>
           <w:rPr>
@@ -3253,7 +3253,7 @@
           <w14:ligatures w14:val="none"/>
         </w:rPr>
       </w:pPr>
-      <w:hyperlink w:anchor="_Toc242317343" w:history="1">
+      <w:hyperlink w:anchor="_Toc244141462" w:history="1">
         <w:r>
           <w:rPr>
             <w:rStyle w:val="a4"/>
@@ -3280,7 +3280,7 @@
             <w:noProof/>
             <w:webHidden/>
           </w:rPr>
-          <w:instrText xml:space="preserve"> PAGEREF _Toc242317343 \h </w:instrText>
+          <w:instrText xml:space="preserve"> PAGEREF _Toc244141462 \h </w:instrText>
         </w:r>
         <w:r>
           <w:rPr>
@@ -3300,7 +3300,7 @@
             <w:noProof/>
             <w:webHidden/>
           </w:rPr>
-          <w:t>26</w:t>
+          <w:t>25</w:t>
         </w:r>
         <w:r>
           <w:rPr>
@@ -3324,7 +3324,7 @@
           <w14:ligatures w14:val="none"/>
         </w:rPr>
       </w:pPr>
-      <w:hyperlink w:anchor="_Toc242317344" w:history="1">
+      <w:hyperlink w:anchor="_Toc244141463" w:history="1">
         <w:r>
           <w:rPr>
             <w:rStyle w:val="a4"/>
@@ -3351,7 +3351,7 @@
             <w:noProof/>
             <w:webHidden/>
           </w:rPr>
-          <w:instrText xml:space="preserve"> PAGEREF _Toc242317344 \h </w:instrText>
+          <w:instrText xml:space="preserve"> PAGEREF _Toc244141463 \h </w:instrText>
         </w:r>
         <w:r>
           <w:rPr>
@@ -3371,7 +3371,7 @@
             <w:noProof/>
             <w:webHidden/>
           </w:rPr>
-          <w:t>27</w:t>
+          <w:t>26</w:t>
         </w:r>
         <w:r>
           <w:rPr>
@@ -3395,7 +3395,7 @@
           <w14:ligatures w14:val="none"/>
         </w:rPr>
       </w:pPr>
-      <w:hyperlink w:anchor="_Toc242317345" w:history="1">
+      <w:hyperlink w:anchor="_Toc244141464" w:history="1">
         <w:r>
           <w:rPr>
             <w:rStyle w:val="a4"/>
@@ -3422,7 +3422,7 @@
             <w:noProof/>
             <w:webHidden/>
           </w:rPr>
-          <w:instrText xml:space="preserve"> PAGEREF _Toc242317345 \h </w:instrText>
+          <w:instrText xml:space="preserve"> PAGEREF _Toc244141464 \h </w:instrText>
         </w:r>
         <w:r>
           <w:rPr>
@@ -3442,7 +3442,7 @@
             <w:noProof/>
             <w:webHidden/>
           </w:rPr>
-          <w:t>27</w:t>
+          <w:t>26</w:t>
         </w:r>
         <w:r>
           <w:rPr>
@@ -3470,7 +3470,7 @@
       <w:pPr>
         <w:pStyle w:val="1"/>
       </w:pPr>
-      <w:bookmarkStart w:id="0" w:name="_Toc242317313"/>
+      <w:bookmarkStart w:id="0" w:name="_Toc244141432"/>
       <w:r>
         <w:lastRenderedPageBreak/>
         <w:t>Описание реализации клиентской части ИС</w:t>
@@ -3481,7 +3481,7 @@
       <w:pPr>
         <w:pStyle w:val="2"/>
       </w:pPr>
-      <w:bookmarkStart w:id="1" w:name="_Toc242317314"/>
+      <w:bookmarkStart w:id="1" w:name="_Toc244141433"/>
       <w:r>
         <w:t>Цель и задание</w:t>
       </w:r>
@@ -3505,7 +3505,7 @@
       <w:pPr>
         <w:pStyle w:val="2"/>
       </w:pPr>
-      <w:bookmarkStart w:id="2" w:name="_Toc242317315"/>
+      <w:bookmarkStart w:id="2" w:name="_Toc244141434"/>
       <w:r>
         <w:t>Результат и связь с предыдущими работами</w:t>
       </w:r>
@@ -4033,7 +4033,7 @@
         <w:pStyle w:val="1"/>
         <w:pageBreakBefore/>
       </w:pPr>
-      <w:bookmarkStart w:id="3" w:name="_Toc242317316"/>
+      <w:bookmarkStart w:id="3" w:name="_Toc244141435"/>
       <w:r>
         <w:lastRenderedPageBreak/>
         <w:t>Задание 1 Дерево фу</w:t>
@@ -5424,7 +5424,7 @@
         <w:pStyle w:val="2"/>
         <w:pageBreakBefore/>
       </w:pPr>
-      <w:bookmarkStart w:id="4" w:name="_Toc242317317"/>
+      <w:bookmarkStart w:id="4" w:name="_Toc244141436"/>
       <w:r>
         <w:lastRenderedPageBreak/>
         <w:t>Корень дерева функций</w:t>
@@ -5449,7 +5449,7 @@
           <w:noProof/>
         </w:rPr>
         <w:drawing>
-          <wp:inline distT="0" distB="0" distL="0" distR="0" wp14:anchorId="1F36DF7E" wp14:editId="17289D7F">
+          <wp:inline distT="0" distB="0" distL="0" distR="0" wp14:anchorId="28AEFCBF" wp14:editId="5C22F38B">
             <wp:extent cx="8306641" cy="2880000"/>
             <wp:effectExtent l="0" t="0" r="0" b="0"/>
             <wp:docPr id="298370852" name="Picture 298370852" descr="Разделение функций клиента"/>
@@ -5519,7 +5519,7 @@
         <w:pStyle w:val="2"/>
         <w:pageBreakBefore/>
       </w:pPr>
-      <w:bookmarkStart w:id="5" w:name="_Toc242317318"/>
+      <w:bookmarkStart w:id="5" w:name="_Toc244141437"/>
       <w:r>
         <w:lastRenderedPageBreak/>
         <w:t>Основная ветвь</w:t>
@@ -5547,7 +5547,7 @@
           <w:noProof/>
         </w:rPr>
         <w:drawing>
-          <wp:inline distT="0" distB="0" distL="0" distR="0" wp14:anchorId="0C2ED7DF" wp14:editId="7C1C4B78">
+          <wp:inline distT="0" distB="0" distL="0" distR="0" wp14:anchorId="43E5F243" wp14:editId="678BDB37">
             <wp:extent cx="8769230" cy="4500000"/>
             <wp:effectExtent l="0" t="0" r="0" b="0"/>
             <wp:docPr id="298370853" name="Picture 298370853" descr="Основные функции B1–B7"/>
@@ -5617,7 +5617,7 @@
         <w:pStyle w:val="2"/>
         <w:pageBreakBefore/>
       </w:pPr>
-      <w:bookmarkStart w:id="6" w:name="_Toc242317319"/>
+      <w:bookmarkStart w:id="6" w:name="_Toc244141438"/>
       <w:r>
         <w:lastRenderedPageBreak/>
         <w:t>Служебная ветвь</w:t>
@@ -5642,7 +5642,7 @@
           <w:noProof/>
         </w:rPr>
         <w:drawing>
-          <wp:inline distT="0" distB="0" distL="0" distR="0" wp14:anchorId="6488230B" wp14:editId="55B53EED">
+          <wp:inline distT="0" distB="0" distL="0" distR="0" wp14:anchorId="7B65B5E0" wp14:editId="07FF5DF8">
             <wp:extent cx="9072000" cy="3461684"/>
             <wp:effectExtent l="0" t="0" r="0" b="0"/>
             <wp:docPr id="298370854" name="Picture 298370854" descr="Служебные функции S1–S5"/>
@@ -5725,7 +5725,7 @@
       <w:pPr>
         <w:pStyle w:val="2"/>
       </w:pPr>
-      <w:bookmarkStart w:id="7" w:name="_Toc242317320"/>
+      <w:bookmarkStart w:id="7" w:name="_Toc244141439"/>
       <w:r>
         <w:lastRenderedPageBreak/>
         <w:t>Пользовательские представления</w:t>
@@ -7686,7 +7686,7 @@
         <w:pStyle w:val="1"/>
         <w:pageBreakBefore/>
       </w:pPr>
-      <w:bookmarkStart w:id="8" w:name="_Toc242317321"/>
+      <w:bookmarkStart w:id="8" w:name="_Toc244141440"/>
       <w:r>
         <w:lastRenderedPageBreak/>
         <w:t>Задание 1 Модели сценари</w:t>
@@ -7700,7 +7700,7 @@
       <w:pPr>
         <w:pStyle w:val="2"/>
       </w:pPr>
-      <w:bookmarkStart w:id="9" w:name="_Toc242317322"/>
+      <w:bookmarkStart w:id="9" w:name="_Toc244141441"/>
       <w:r>
         <w:t>Диалог инженера</w:t>
       </w:r>
@@ -7732,7 +7732,7 @@
       <w:pPr>
         <w:pStyle w:val="2"/>
       </w:pPr>
-      <w:bookmarkStart w:id="10" w:name="_Toc242317323"/>
+      <w:bookmarkStart w:id="10" w:name="_Toc244141442"/>
       <w:r>
         <w:t>Диалог менеджера</w:t>
       </w:r>
@@ -8251,7 +8251,7 @@
         <w:pStyle w:val="2"/>
         <w:pageBreakBefore/>
       </w:pPr>
-      <w:bookmarkStart w:id="11" w:name="_Toc242317324"/>
+      <w:bookmarkStart w:id="11" w:name="_Toc244141443"/>
       <w:r>
         <w:lastRenderedPageBreak/>
         <w:t>Вход и расчёт инженера</w:t>
@@ -8279,7 +8279,7 @@
           <w:noProof/>
         </w:rPr>
         <w:drawing>
-          <wp:inline distT="0" distB="0" distL="0" distR="0" wp14:anchorId="253BF373" wp14:editId="07F74518">
+          <wp:inline distT="0" distB="0" distL="0" distR="0" wp14:anchorId="6AC4B5DA" wp14:editId="17816655">
             <wp:extent cx="6053097" cy="4500000"/>
             <wp:effectExtent l="0" t="0" r="0" b="0"/>
             <wp:docPr id="298370855" name="Picture 298370855" descr="Сценарий входа редактирования и расчёта"/>
@@ -8349,7 +8349,7 @@
         <w:pStyle w:val="2"/>
         <w:pageBreakBefore/>
       </w:pPr>
-      <w:bookmarkStart w:id="12" w:name="_Toc242317325"/>
+      <w:bookmarkStart w:id="12" w:name="_Toc244141444"/>
       <w:r>
         <w:lastRenderedPageBreak/>
         <w:t>Сохранение состава</w:t>
@@ -8374,7 +8374,7 @@
           <w:noProof/>
         </w:rPr>
         <w:drawing>
-          <wp:inline distT="0" distB="0" distL="0" distR="0" wp14:anchorId="342253AE" wp14:editId="23F10943">
+          <wp:inline distT="0" distB="0" distL="0" distR="0" wp14:anchorId="5A3F8133" wp14:editId="514C75D1">
             <wp:extent cx="6640776" cy="4500000"/>
             <wp:effectExtent l="0" t="0" r="0" b="0"/>
             <wp:docPr id="298370856" name="Picture 298370856" descr="Сценарий добавления новой версии"/>
@@ -8447,7 +8447,7 @@
         <w:pStyle w:val="2"/>
         <w:pageBreakBefore/>
       </w:pPr>
-      <w:bookmarkStart w:id="13" w:name="_Toc242317326"/>
+      <w:bookmarkStart w:id="13" w:name="_Toc244141445"/>
       <w:r>
         <w:lastRenderedPageBreak/>
         <w:t>Создание ревизии</w:t>
@@ -8472,7 +8472,7 @@
           <w:noProof/>
         </w:rPr>
         <w:drawing>
-          <wp:inline distT="0" distB="0" distL="0" distR="0" wp14:anchorId="70FD1B04" wp14:editId="390253D3">
+          <wp:inline distT="0" distB="0" distL="0" distR="0" wp14:anchorId="7D50A92A" wp14:editId="1A76B316">
             <wp:extent cx="6840000" cy="4500000"/>
             <wp:effectExtent l="0" t="0" r="0" b="0"/>
             <wp:docPr id="298370857" name="Picture 298370857" descr="Сценарий менеджера без внешней отправки"/>
@@ -8555,7 +8555,7 @@
       <w:pPr>
         <w:pStyle w:val="1"/>
       </w:pPr>
-      <w:bookmarkStart w:id="14" w:name="_Toc242317327"/>
+      <w:bookmarkStart w:id="14" w:name="_Toc244141446"/>
       <w:r>
         <w:lastRenderedPageBreak/>
         <w:t>Фактические экранные формы</w:t>
@@ -8567,17 +8567,17 @@
         <w:pStyle w:val="ReportBody"/>
       </w:pPr>
       <w:r>
-        <w:t>Следующие иллюстрации получены в работающем локальном браузере 08.10.2026 [6]. Для печати показаны законченные фрагменты нужного блока. Полные снимки, контрольные суммы и описания контрольных точек сохранены с исходниками проверк</w:t>
-      </w:r>
-      <w:r>
-        <w:t>и.</w:t>
+        <w:t xml:space="preserve">Следующие иллюстрации получены в работающем локальном браузере 08.10.2026 [6]. Снимки приведены целиком с сохранением исходных пропорций. На них видны роль, навигация и контекст операции; контрольные суммы и описания контрольных </w:t>
+      </w:r>
+      <w:r>
+        <w:t>точек сохранены с исходниками проверки.</w:t>
       </w:r>
     </w:p>
     <w:p>
       <w:pPr>
         <w:pStyle w:val="2"/>
       </w:pPr>
-      <w:bookmarkStart w:id="15" w:name="_Toc242317328"/>
+      <w:bookmarkStart w:id="15" w:name="_Toc244141447"/>
       <w:r>
         <w:t>Форма входа</w:t>
       </w:r>
@@ -8601,8 +8601,8 @@
           <w:noProof/>
         </w:rPr>
         <w:drawing>
-          <wp:inline distT="0" distB="0" distL="0" distR="0" wp14:anchorId="2956AABB" wp14:editId="7CE0A30B">
-            <wp:extent cx="4968000" cy="5665634"/>
+          <wp:inline distT="0" distB="0" distL="0" distR="0" wp14:anchorId="56C10C29" wp14:editId="46FC7170">
+            <wp:extent cx="5940000" cy="4455000"/>
             <wp:effectExtent l="0" t="0" r="0" b="0"/>
             <wp:docPr id="298370858" name="Picture 298370858" descr="Демонстрационная форма входа"/>
             <wp:cNvGraphicFramePr>
@@ -8612,7 +8612,7 @@
               <a:graphicData uri="http://schemas.openxmlformats.org/drawingml/2006/picture">
                 <pic:pic xmlns:pic="http://schemas.openxmlformats.org/drawingml/2006/picture">
                   <pic:nvPicPr>
-                    <pic:cNvPr id="0" name="ПР10_Фрагмент_входа.jpg"/>
+                    <pic:cNvPr id="0" name="ПР10_Экран_входа.jpg"/>
                     <pic:cNvPicPr/>
                   </pic:nvPicPr>
                   <pic:blipFill>
@@ -8624,7 +8624,7 @@
                   <pic:spPr>
                     <a:xfrm>
                       <a:off x="0" y="0"/>
-                      <a:ext cx="4968000" cy="5665634"/>
+                      <a:ext cx="5940000" cy="4455000"/>
                     </a:xfrm>
                     <a:prstGeom prst="rect">
                       <a:avLst/>
@@ -8667,25 +8667,15 @@
       </w:r>
     </w:p>
     <w:p>
-      <w:pPr>
-        <w:sectPr>
-          <w:headerReference w:type="default" r:id="rId37"/>
-          <w:footerReference w:type="default" r:id="rId38"/>
-          <w:headerReference w:type="first" r:id="rId39"/>
-          <w:footerReference w:type="first" r:id="rId40"/>
-          <w:pgSz w:w="11906" w:h="16838"/>
-          <w:pgMar w:top="1134" w:right="850" w:bottom="1134" w:left="1701" w:header="454" w:footer="567" w:gutter="0"/>
-          <w:cols w:space="720"/>
-          <w:docGrid w:linePitch="381"/>
-        </w:sectPr>
-      </w:pPr>
+      <w:r>
+        <w:br w:type="page"/>
+      </w:r>
     </w:p>
     <w:p>
       <w:pPr>
         <w:pStyle w:val="2"/>
-        <w:pageBreakBefore/>
-      </w:pPr>
-      <w:bookmarkStart w:id="16" w:name="_Toc242317329"/>
+      </w:pPr>
+      <w:bookmarkStart w:id="16" w:name="_Toc244141448"/>
       <w:r>
         <w:lastRenderedPageBreak/>
         <w:t>Редактор состава</w:t>
@@ -8698,10 +8688,10 @@
         <w:keepNext/>
       </w:pPr>
       <w:r>
-        <w:t>На рисунке 8 показаны все шесть позиций модельного ряда в</w:t>
-      </w:r>
-      <w:r>
-        <w:t xml:space="preserve"> редакторе; количество RAM равно 2.</w:t>
+        <w:t>На рисунке 8 показаны все шесть позиций модельно</w:t>
+      </w:r>
+      <w:r>
+        <w:t>го ряда в редакторе; количество RAM равно 2.</w:t>
       </w:r>
     </w:p>
     <w:p>
@@ -8713,8 +8703,8 @@
           <w:noProof/>
         </w:rPr>
         <w:drawing>
-          <wp:inline distT="0" distB="0" distL="0" distR="0" wp14:anchorId="50DBD867" wp14:editId="1D09C78E">
-            <wp:extent cx="8635401" cy="4464000"/>
+          <wp:inline distT="0" distB="0" distL="0" distR="0" wp14:anchorId="5D98A8C8" wp14:editId="448FEB5B">
+            <wp:extent cx="5940000" cy="4455000"/>
             <wp:effectExtent l="0" t="0" r="0" b="0"/>
             <wp:docPr id="298370859" name="Picture 298370859" descr="Шесть позиций редактора инженера"/>
             <wp:cNvGraphicFramePr>
@@ -8724,11 +8714,11 @@
               <a:graphicData uri="http://schemas.openxmlformats.org/drawingml/2006/picture">
                 <pic:pic xmlns:pic="http://schemas.openxmlformats.org/drawingml/2006/picture">
                   <pic:nvPicPr>
-                    <pic:cNvPr id="0" name="ПР10_Фрагмент_инженера.jpg"/>
+                    <pic:cNvPr id="0" name="ПР10_Экран_инженера.jpg"/>
                     <pic:cNvPicPr/>
                   </pic:nvPicPr>
                   <pic:blipFill>
-                    <a:blip r:embed="rId41"/>
+                    <a:blip r:embed="rId37"/>
                     <a:stretch>
                       <a:fillRect/>
                     </a:stretch>
@@ -8736,7 +8726,7 @@
                   <pic:spPr>
                     <a:xfrm>
                       <a:off x="0" y="0"/>
-                      <a:ext cx="8635401" cy="4464000"/>
+                      <a:ext cx="5940000" cy="4455000"/>
                     </a:xfrm>
                     <a:prstGeom prst="rect">
                       <a:avLst/>
@@ -8779,11 +8769,15 @@
       </w:r>
     </w:p>
     <w:p>
+      <w:r>
+        <w:br w:type="page"/>
+      </w:r>
+    </w:p>
+    <w:p>
       <w:pPr>
         <w:pStyle w:val="2"/>
-        <w:pageBreakBefore/>
-      </w:pPr>
-      <w:bookmarkStart w:id="17" w:name="_Toc242317330"/>
+      </w:pPr>
+      <w:bookmarkStart w:id="17" w:name="_Toc244141449"/>
       <w:r>
         <w:lastRenderedPageBreak/>
         <w:t>Результат расчёта</w:t>
@@ -8808,8 +8802,8 @@
           <w:noProof/>
         </w:rPr>
         <w:drawing>
-          <wp:inline distT="0" distB="0" distL="0" distR="0" wp14:anchorId="1B3947CA" wp14:editId="7F83C282">
-            <wp:extent cx="9072000" cy="4248313"/>
+          <wp:inline distT="0" distB="0" distL="0" distR="0" wp14:anchorId="6044CEB5" wp14:editId="4ABAEEFD">
+            <wp:extent cx="5940000" cy="5758500"/>
             <wp:effectExtent l="0" t="0" r="0" b="0"/>
             <wp:docPr id="298370860" name="Picture 298370860" descr="Выходная форма подбора и расчёта инженера"/>
             <wp:cNvGraphicFramePr>
@@ -8819,11 +8813,11 @@
               <a:graphicData uri="http://schemas.openxmlformats.org/drawingml/2006/picture">
                 <pic:pic xmlns:pic="http://schemas.openxmlformats.org/drawingml/2006/picture">
                   <pic:nvPicPr>
-                    <pic:cNvPr id="0" name="ПР10_Фрагмент_расчёта.jpg"/>
+                    <pic:cNvPr id="0" name="ПР10_Результат_расчёта.jpg"/>
                     <pic:cNvPicPr/>
                   </pic:nvPicPr>
                   <pic:blipFill>
-                    <a:blip r:embed="rId42"/>
+                    <a:blip r:embed="rId38"/>
                     <a:stretch>
                       <a:fillRect/>
                     </a:stretch>
@@ -8831,7 +8825,7 @@
                   <pic:spPr>
                     <a:xfrm>
                       <a:off x="0" y="0"/>
-                      <a:ext cx="9072000" cy="4248313"/>
+                      <a:ext cx="5940000" cy="5758500"/>
                     </a:xfrm>
                     <a:prstGeom prst="rect">
                       <a:avLst/>
@@ -8874,11 +8868,15 @@
       </w:r>
     </w:p>
     <w:p>
+      <w:r>
+        <w:br w:type="page"/>
+      </w:r>
+    </w:p>
+    <w:p>
       <w:pPr>
         <w:pStyle w:val="2"/>
-        <w:pageBreakBefore/>
-      </w:pPr>
-      <w:bookmarkStart w:id="18" w:name="_Toc242317331"/>
+      </w:pPr>
+      <w:bookmarkStart w:id="18" w:name="_Toc244141450"/>
       <w:r>
         <w:lastRenderedPageBreak/>
         <w:t>История карточки</w:t>
@@ -8903,8 +8901,8 @@
           <w:noProof/>
         </w:rPr>
         <w:drawing>
-          <wp:inline distT="0" distB="0" distL="0" distR="0" wp14:anchorId="7CC9E2EB" wp14:editId="68134E93">
-            <wp:extent cx="9072000" cy="2766526"/>
+          <wp:inline distT="0" distB="0" distL="0" distR="0" wp14:anchorId="006F35B5" wp14:editId="456C1368">
+            <wp:extent cx="5940000" cy="6348375"/>
             <wp:effectExtent l="0" t="0" r="0" b="0"/>
             <wp:docPr id="298370861" name="Picture 298370861" descr="Новая ревизия и сохранённая история"/>
             <wp:cNvGraphicFramePr>
@@ -8914,11 +8912,11 @@
               <a:graphicData uri="http://schemas.openxmlformats.org/drawingml/2006/picture">
                 <pic:pic xmlns:pic="http://schemas.openxmlformats.org/drawingml/2006/picture">
                   <pic:nvPicPr>
-                    <pic:cNvPr id="0" name="ПР10_Фрагмент_ревизий.jpg"/>
+                    <pic:cNvPr id="0" name="ПР10_История_ревизий.jpg"/>
                     <pic:cNvPicPr/>
                   </pic:nvPicPr>
                   <pic:blipFill>
-                    <a:blip r:embed="rId43"/>
+                    <a:blip r:embed="rId39"/>
                     <a:stretch>
                       <a:fillRect/>
                     </a:stretch>
@@ -8926,7 +8924,7 @@
                   <pic:spPr>
                     <a:xfrm>
                       <a:off x="0" y="0"/>
-                      <a:ext cx="9072000" cy="2766526"/>
+                      <a:ext cx="5940000" cy="6348375"/>
                     </a:xfrm>
                     <a:prstGeom prst="rect">
                       <a:avLst/>
@@ -8969,14 +8967,21 @@
       </w:r>
     </w:p>
     <w:p>
+      <w:r>
+        <w:br w:type="page"/>
+      </w:r>
+    </w:p>
+    <w:p>
       <w:pPr>
         <w:pStyle w:val="2"/>
-        <w:pageBreakBefore/>
-      </w:pPr>
-      <w:bookmarkStart w:id="19" w:name="_Toc242317332"/>
+      </w:pPr>
+      <w:bookmarkStart w:id="19" w:name="_Toc244141451"/>
       <w:r>
         <w:lastRenderedPageBreak/>
-        <w:t>Служебное представление</w:t>
+        <w:t xml:space="preserve">Служебное </w:t>
+      </w:r>
+      <w:r>
+        <w:t>представление</w:t>
       </w:r>
       <w:bookmarkEnd w:id="19"/>
     </w:p>
@@ -8986,10 +8991,7 @@
         <w:keepNext/>
       </w:pPr>
       <w:r>
-        <w:t xml:space="preserve">На </w:t>
-      </w:r>
-      <w:r>
-        <w:t>рисунке 11 показаны отдельная учебная БД, роль ppois_viewer и режим READ ONLY.</w:t>
+        <w:t>На рисунке 11 показаны отдельная учебная БД, роль ppois_viewer и режим READ ONLY.</w:t>
       </w:r>
     </w:p>
     <w:p>
@@ -9001,8 +9003,8 @@
           <w:noProof/>
         </w:rPr>
         <w:drawing>
-          <wp:inline distT="0" distB="0" distL="0" distR="0" wp14:anchorId="47BA4B52" wp14:editId="50E87489">
-            <wp:extent cx="9072000" cy="2908400"/>
+          <wp:inline distT="0" distB="0" distL="0" distR="0" wp14:anchorId="5E314E87" wp14:editId="249E7CDE">
+            <wp:extent cx="5940000" cy="4455000"/>
             <wp:effectExtent l="0" t="0" r="0" b="0"/>
             <wp:docPr id="298370862" name="Picture 298370862" descr="Диагностика администратора"/>
             <wp:cNvGraphicFramePr>
@@ -9012,11 +9014,11 @@
               <a:graphicData uri="http://schemas.openxmlformats.org/drawingml/2006/picture">
                 <pic:pic xmlns:pic="http://schemas.openxmlformats.org/drawingml/2006/picture">
                   <pic:nvPicPr>
-                    <pic:cNvPr id="0" name="ПР10_Фрагмент_диагностики.jpg"/>
+                    <pic:cNvPr id="0" name="ПР10_Экран_администратора.jpg"/>
                     <pic:cNvPicPr/>
                   </pic:nvPicPr>
                   <pic:blipFill>
-                    <a:blip r:embed="rId44"/>
+                    <a:blip r:embed="rId40"/>
                     <a:stretch>
                       <a:fillRect/>
                     </a:stretch>
@@ -9024,7 +9026,7 @@
                   <pic:spPr>
                     <a:xfrm>
                       <a:off x="0" y="0"/>
-                      <a:ext cx="9072000" cy="2908400"/>
+                      <a:ext cx="5940000" cy="4455000"/>
                     </a:xfrm>
                     <a:prstGeom prst="rect">
                       <a:avLst/>
@@ -9071,7 +9073,7 @@
         <w:pStyle w:val="1"/>
         <w:pageBreakBefore/>
       </w:pPr>
-      <w:bookmarkStart w:id="20" w:name="_Toc242317333"/>
+      <w:bookmarkStart w:id="20" w:name="_Toc244141452"/>
       <w:r>
         <w:lastRenderedPageBreak/>
         <w:t>Задание 2 Структурная схема ИС</w:t>
@@ -9084,10 +9086,10 @@
         <w:keepNext/>
       </w:pPr>
       <w:r>
-        <w:t>На рисунке 12 показаны действительные модули и направления вызовов; ответы возв</w:t>
-      </w:r>
-      <w:r>
-        <w:t>ращаются вызывающему модулю.</w:t>
+        <w:t xml:space="preserve">На рисунке 12 показаны действительные модули и </w:t>
+      </w:r>
+      <w:r>
+        <w:t>направления вызовов; ответы возвращаются вызывающему модулю.</w:t>
       </w:r>
     </w:p>
     <w:p>
@@ -9099,8 +9101,8 @@
           <w:noProof/>
         </w:rPr>
         <w:drawing>
-          <wp:inline distT="0" distB="0" distL="0" distR="0" wp14:anchorId="00CB8D41" wp14:editId="1BF6B628">
-            <wp:extent cx="7898383" cy="4500000"/>
+          <wp:inline distT="0" distB="0" distL="0" distR="0" wp14:anchorId="6F2912BC" wp14:editId="15C09815">
+            <wp:extent cx="5940000" cy="3384237"/>
             <wp:effectExtent l="0" t="0" r="0" b="0"/>
             <wp:docPr id="298370863" name="Picture 298370863" descr="Структурная схема версии 0.2"/>
             <wp:cNvGraphicFramePr>
@@ -9114,7 +9116,7 @@
                     <pic:cNvPicPr/>
                   </pic:nvPicPr>
                   <pic:blipFill>
-                    <a:blip r:embed="rId45"/>
+                    <a:blip r:embed="rId41"/>
                     <a:stretch>
                       <a:fillRect/>
                     </a:stretch>
@@ -9122,7 +9124,7 @@
                   <pic:spPr>
                     <a:xfrm>
                       <a:off x="0" y="0"/>
-                      <a:ext cx="7898383" cy="4500000"/>
+                      <a:ext cx="5940000" cy="3384237"/>
                     </a:xfrm>
                     <a:prstGeom prst="rect">
                       <a:avLst/>
@@ -9166,25 +9168,10 @@
     </w:p>
     <w:p>
       <w:pPr>
-        <w:sectPr>
-          <w:headerReference w:type="default" r:id="rId46"/>
-          <w:footerReference w:type="default" r:id="rId47"/>
-          <w:headerReference w:type="first" r:id="rId48"/>
-          <w:footerReference w:type="first" r:id="rId49"/>
-          <w:pgSz w:w="16838" w:h="11906" w:orient="landscape"/>
-          <w:pgMar w:top="1134" w:right="850" w:bottom="1134" w:left="1701" w:header="454" w:footer="567" w:gutter="0"/>
-          <w:cols w:space="720"/>
-          <w:docGrid w:linePitch="381"/>
-        </w:sectPr>
-      </w:pPr>
-    </w:p>
-    <w:p>
-      <w:pPr>
         <w:pStyle w:val="2"/>
       </w:pPr>
-      <w:bookmarkStart w:id="21" w:name="_Toc242317334"/>
-      <w:r>
-        <w:lastRenderedPageBreak/>
+      <w:bookmarkStart w:id="21" w:name="_Toc244141453"/>
+      <w:r>
         <w:t>Распределение ответственности</w:t>
       </w:r>
       <w:bookmarkEnd w:id="21"/>
@@ -9747,6 +9734,7 @@
               <w:pStyle w:val="ReportTable"/>
             </w:pPr>
             <w:r>
+              <w:lastRenderedPageBreak/>
               <w:t>Прикладные операции</w:t>
             </w:r>
           </w:p>
@@ -10174,9 +10162,8 @@
       <w:pPr>
         <w:pStyle w:val="2"/>
       </w:pPr>
-      <w:bookmarkStart w:id="22" w:name="_Toc242317335"/>
-      <w:r>
-        <w:lastRenderedPageBreak/>
+      <w:bookmarkStart w:id="22" w:name="_Toc244141454"/>
+      <w:r>
         <w:t>Внутренние HTTP-маршруты</w:t>
       </w:r>
       <w:bookmarkEnd w:id="22"/>
@@ -10186,10 +10173,10 @@
         <w:pStyle w:val="ReportBody"/>
       </w:pPr>
       <w:r>
-        <w:t>В таблице ниже перечислены все 12 маршрутов локального сервера [5]. Это внутренний контракт учебного клиента, не спецификация</w:t>
-      </w:r>
-      <w:r>
-        <w:t xml:space="preserve"> Ozon API. Вход публичен; остальные операции требуют действующего сеанса. Изменяющие защищённые запросы также требуют CSRF-токена. Справка S5 выполняется в браузере без собственного маршрута API.</w:t>
+        <w:t xml:space="preserve">В таблице ниже перечислены все 12 маршрутов локального сервера [5]. Это внутренний контракт учебного клиента, не </w:t>
+      </w:r>
+      <w:r>
+        <w:t>спецификация Ozon API. Вход публичен; остальные операции требуют действующего сеанса. Изменяющие защищённые запросы также требуют CSRF-токена. Справка S5 выполняется в браузере без собственного маршрута API.</w:t>
       </w:r>
     </w:p>
     <w:p>
@@ -10212,7 +10199,10 @@
         <w:fldChar w:fldCharType="begin"/>
       </w:r>
       <w:r>
-        <w:instrText xml:space="preserve"> SEQ Table \* ARABIC </w:instrText>
+        <w:instrText xml:space="preserve"> SEQ Tab</w:instrText>
+      </w:r>
+      <w:r>
+        <w:instrText xml:space="preserve">le \* ARABIC </w:instrText>
       </w:r>
       <w:r>
         <w:fldChar w:fldCharType="separate"/>
@@ -10634,6 +10624,7 @@
               <w:pStyle w:val="ReportTable"/>
             </w:pPr>
             <w:r>
+              <w:lastRenderedPageBreak/>
               <w:t>GET /api/catalog</w:t>
             </w:r>
           </w:p>
@@ -11383,7 +11374,7 @@
       <w:pPr>
         <w:pStyle w:val="2"/>
       </w:pPr>
-      <w:bookmarkStart w:id="23" w:name="_Toc242317336"/>
+      <w:bookmarkStart w:id="23" w:name="_Toc244141455"/>
       <w:r>
         <w:t>Целостность взаимодействия</w:t>
       </w:r>
@@ -11400,43 +11391,43 @@
         <w:t>проверяет право до чтения тела защищённой операции и до обращения к БД. Затем проверяет типы, диапазоны и бизнес-условия. Количество — положительное целое без boolean, позиция содержит группу либо компонент, номер строки уникален. Экономические значения пе</w:t>
       </w:r>
       <w:r>
-        <w:t xml:space="preserve">редаются </w:t>
+        <w:t>редаются десятичными строками; комиссия меньше 1, шаг округления положителен, NaN и бесконечность запрещены. Время расчёта задаёт сервер.</w:t>
+      </w:r>
+    </w:p>
+    <w:p>
+      <w:pPr>
+        <w:pStyle w:val="ReportBody"/>
+      </w:pPr>
+      <w:r>
+        <w:t>Ожидаемые номера защищают добавление состава и ревизии от устаревших действий. Внутри транзакции блокируется последова</w:t>
+      </w:r>
+      <w:r>
+        <w:t>тельность соответствующего объекта. Успешная запись создаёт следующий номер; ошибка приводит к откату. Пересчёт перед сохранением ревизии не позволяет использовать ранее показанную клиентом цену как доверенный итог. Выбранные предложения должны совпасть со</w:t>
+      </w:r>
+      <w:r>
+        <w:t xml:space="preserve"> снимком проверенного состава.</w:t>
+      </w:r>
+    </w:p>
+    <w:p>
+      <w:pPr>
+        <w:pStyle w:val="ReportBody"/>
+      </w:pPr>
+      <w:r>
+        <w:t>Прикладное соединение переводится в ppois_engineer, ppois_manager или ppois_viewer. Чтение выполняется в READ ONLY; администратор диагностики использует ppois_viewer. Сервер слушает только loopback, допускает согласованный Ho</w:t>
+      </w:r>
+      <w:r>
+        <w:t xml:space="preserve">st и отклоняет чужой Origin для POST. Cookie </w:t>
       </w:r>
       <w:r>
         <w:lastRenderedPageBreak/>
-        <w:t>десятичными строками; комиссия меньше 1, шаг округления положителен, NaN и бесконечность запрещены. Время расчёта задаёт сервер.</w:t>
-      </w:r>
-    </w:p>
-    <w:p>
-      <w:pPr>
-        <w:pStyle w:val="ReportBody"/>
-      </w:pPr>
-      <w:r>
-        <w:t>Ожидаемые номера защищают добавление состава и ревизии от устаревших действий. Внутри транзакции блокируется последова</w:t>
-      </w:r>
-      <w:r>
-        <w:t>тельность соответствующего объекта. Успешная запись создаёт следующий номер; ошибка приводит к откату. Пересчёт перед сохранением ревизии не позволяет использовать ранее показанную клиентом цену как доверенный итог. Выбранные предложения должны совпасть со</w:t>
-      </w:r>
-      <w:r>
-        <w:t xml:space="preserve"> снимком проверенного состава.</w:t>
-      </w:r>
-    </w:p>
-    <w:p>
-      <w:pPr>
-        <w:pStyle w:val="ReportBody"/>
-      </w:pPr>
-      <w:r>
-        <w:t>Прикладное соединение переводится в ppois_engineer, ppois_manager или ppois_viewer. Чтение выполняется в READ ONLY; администратор диагностики использует ppois_viewer. Сервер слушает только loopback, допускает согласованный Ho</w:t>
-      </w:r>
-      <w:r>
-        <w:t>st и отклоняет чужой Origin для POST. Cookie имеет HttpOnly и SameSite=Strict; Secure не установлен, поскольку учебный стенд использует локальный HTTP. Для промышленного размещения потребуются TLS и иная политика аутентификации.</w:t>
+        <w:t>имеет HttpOnly и SameSite=Strict; Secure не установлен, поскольку учебный стенд использует локальный HTTP. Для промышленного размещения потребуются TLS и иная политика аутентификации.</w:t>
       </w:r>
     </w:p>
     <w:p>
       <w:pPr>
         <w:pStyle w:val="1"/>
       </w:pPr>
-      <w:bookmarkStart w:id="24" w:name="_Toc242317337"/>
+      <w:bookmarkStart w:id="24" w:name="_Toc244141456"/>
       <w:r>
         <w:t>Проверка реализации</w:t>
       </w:r>
@@ -11446,7 +11437,7 @@
       <w:pPr>
         <w:pStyle w:val="2"/>
       </w:pPr>
-      <w:bookmarkStart w:id="25" w:name="_Toc242317338"/>
+      <w:bookmarkStart w:id="25" w:name="_Toc244141457"/>
       <w:r>
         <w:t>Метод и</w:t>
       </w:r>
@@ -11501,7 +11492,10 @@
         <w:fldChar w:fldCharType="end"/>
       </w:r>
       <w:r>
-        <w:t xml:space="preserve"> – Виды проверки и полученный результат</w:t>
+        <w:t xml:space="preserve"> – Виды проверки и получен</w:t>
+      </w:r>
+      <w:r>
+        <w:t>ный результат</w:t>
       </w:r>
     </w:p>
     <w:tbl>
@@ -11733,7 +11727,6 @@
               <w:pStyle w:val="ReportTable"/>
             </w:pPr>
             <w:r>
-              <w:lastRenderedPageBreak/>
               <w:t>Браузер: 18 точек</w:t>
             </w:r>
           </w:p>
@@ -11760,7 +11753,10 @@
               <w:pStyle w:val="ReportTable"/>
             </w:pPr>
             <w:r>
-              <w:t>Четыре роли, ошибочный пароль, количество 0, исправление, потеря актуальности результата, смена версии, выход и запись.</w:t>
+              <w:t xml:space="preserve">Четыре роли, ошибочный </w:t>
+            </w:r>
+            <w:r>
+              <w:t>пароль, количество 0, исправление, потеря актуальности результата, смена версии, выход и запись.</w:t>
             </w:r>
           </w:p>
         </w:tc>
@@ -11870,10 +11866,10 @@
               <w:pStyle w:val="ReportTable"/>
             </w:pPr>
             <w:r>
-              <w:t>56 записей;</w:t>
-            </w:r>
-            <w:r>
-              <w:t xml:space="preserve"> только ожидаемые добавления.</w:t>
+              <w:t>56 записей; только ожидаемые добав</w:t>
+            </w:r>
+            <w:r>
+              <w:t>ления.</w:t>
             </w:r>
           </w:p>
         </w:tc>
@@ -12015,10 +12011,10 @@
               <w:pStyle w:val="ReportTable"/>
             </w:pPr>
             <w:r>
-              <w:t>Семь экспортов модели и 15 фактических снимков; пять печатных ф</w:t>
-            </w:r>
-            <w:r>
-              <w:t>рагментов выбраны для отчёта.</w:t>
+              <w:t>Семь экспортов модели и 15 фактических снимков; пять полных снимков выбраны для отчёта</w:t>
+            </w:r>
+            <w:r>
+              <w:t>.</w:t>
             </w:r>
           </w:p>
         </w:tc>
@@ -12055,17 +12051,21 @@
         <w:pStyle w:val="ReportBody"/>
       </w:pPr>
       <w:r>
-        <w:t xml:space="preserve">HTTP-тесты дополнительно проверяют истечение и отзыв сеанса, неправильный Host и Origin, ошибку JSON, неподдерживаемый тип тела и размер больше 65 536 байт. Прямые запросы менеджера и </w:t>
-      </w:r>
-      <w:r>
-        <w:t>наблюдателя к записи состава, инженера к записи ревизии и администратора к бизнес-разделам отклоняются. Проверяется, что расчёт не меняет число записей и что исходная БД №7 запрещена конфигурацией сервера.</w:t>
+        <w:t xml:space="preserve">HTTP-тесты дополнительно проверяют истечение и отзыв сеанса, неправильный Host и Origin, ошибку JSON, неподдерживаемый тип тела и размер больше 65 536 байт. Прямые запросы менеджера и наблюдателя к записи состава, </w:t>
+      </w:r>
+      <w:r>
+        <w:t>инженера к записи ревизии и администратора к бизнес-</w:t>
+      </w:r>
+      <w:r>
+        <w:lastRenderedPageBreak/>
+        <w:t>разделам отклоняются. Проверяется, что расчёт не меняет число записей и что исходная БД №7 запрещена конфигурацией сервера.</w:t>
       </w:r>
     </w:p>
     <w:p>
       <w:pPr>
         <w:pStyle w:val="2"/>
       </w:pPr>
-      <w:bookmarkStart w:id="26" w:name="_Toc242317339"/>
+      <w:bookmarkStart w:id="26" w:name="_Toc244141458"/>
       <w:r>
         <w:t>Наблюдения в браузере</w:t>
       </w:r>
@@ -12077,10 +12077,7 @@
         <w:keepNext/>
       </w:pPr>
       <w:r>
-        <w:t>Сведения приведены в таблице</w:t>
-      </w:r>
-      <w:r>
-        <w:t xml:space="preserve"> 9.</w:t>
+        <w:t>Сведения приведены в таблице 9.</w:t>
       </w:r>
     </w:p>
     <w:p>
@@ -12094,7 +12091,10 @@
         <w:fldChar w:fldCharType="begin"/>
       </w:r>
       <w:r>
-        <w:instrText xml:space="preserve"> SEQ Table \* ARABIC </w:instrText>
+        <w:instrText xml:space="preserve"> SEQ Table \* ARAB</w:instrText>
+      </w:r>
+      <w:r>
+        <w:instrText xml:space="preserve">IC </w:instrText>
       </w:r>
       <w:r>
         <w:fldChar w:fldCharType="separate"/>
@@ -12313,10 +12313,7 @@
               <w:pStyle w:val="ReportTable"/>
             </w:pPr>
             <w:r>
-              <w:t xml:space="preserve">Смена версии при изменённом количестве требует решения; </w:t>
-            </w:r>
-            <w:r>
-              <w:t>исходный выбор и 0 сохранены</w:t>
+              <w:t>Смена версии при изменённом количестве требует решения; исходный выбор и 0 сохранены</w:t>
             </w:r>
           </w:p>
         </w:tc>
@@ -12552,7 +12549,10 @@
               <w:pStyle w:val="ReportTable"/>
             </w:pPr>
             <w:r>
-              <w:t>Сохранение инженером создало версию 3 CHECKED без перезаписи 1 и 2</w:t>
+              <w:t>Сохранение инженером создало версию 3 CH</w:t>
+            </w:r>
+            <w:r>
+              <w:t>ECKED без перезаписи 1 и 2</w:t>
             </w:r>
           </w:p>
         </w:tc>
@@ -12729,10 +12729,7 @@
               <w:pStyle w:val="ReportTable"/>
             </w:pPr>
             <w:r>
-              <w:t xml:space="preserve">Менеджер не редактирует состав; ревизия для </w:t>
-            </w:r>
-            <w:r>
-              <w:t>DRAFT-версии 2 недоступна</w:t>
+              <w:t>Менеджер не редактирует состав; ревизия для DRAFT-версии 2 недоступна</w:t>
             </w:r>
           </w:p>
         </w:tc>
@@ -12791,7 +12788,10 @@
               <w:pStyle w:val="ReportTable"/>
             </w:pPr>
             <w:r>
-              <w:t>Менеджер создал ревизию 2 DRAFT на версии состава 3, ревизия 1 READY сохранена</w:t>
+              <w:t xml:space="preserve">Менеджер создал </w:t>
+            </w:r>
+            <w:r>
+              <w:t>ревизию 2 DRAFT на версии состава 3, ревизия 1 READY сохранена</w:t>
             </w:r>
           </w:p>
         </w:tc>
@@ -12824,7 +12824,6 @@
               <w:jc w:val="center"/>
             </w:pPr>
             <w:r>
-              <w:lastRenderedPageBreak/>
               <w:t>UI11</w:t>
             </w:r>
           </w:p>
@@ -12910,10 +12909,7 @@
               <w:pStyle w:val="ReportTable"/>
             </w:pPr>
             <w:r>
-              <w:t>Наблюдатель видит сохранённые версии, поля заблокирова</w:t>
-            </w:r>
-            <w:r>
-              <w:t>ны, кнопок записи нет</w:t>
+              <w:t>Наблюдатель видит сохранённые версии, поля заблокированы, кнопок записи нет</w:t>
             </w:r>
           </w:p>
         </w:tc>
@@ -13090,10 +13086,10 @@
               <w:pStyle w:val="ReportTable"/>
             </w:pPr>
             <w:r>
-              <w:t xml:space="preserve">Администратор видит </w:t>
-            </w:r>
-            <w:r>
-              <w:t>только диагностику и справку; соединение ограничено ppois_viewer, read_only=on</w:t>
+              <w:t>Администратор видит только диагностику и справку; соединен</w:t>
+            </w:r>
+            <w:r>
+              <w:t>ие ограничено ppois_viewer, read_only=on</w:t>
             </w:r>
           </w:p>
         </w:tc>
@@ -13270,10 +13266,7 @@
               <w:pStyle w:val="ReportTable"/>
             </w:pPr>
             <w:r>
-              <w:t>Менеджер также рассчитывает сохранённую версию 3: 7</w:t>
-            </w:r>
-            <w:r>
-              <w:t>6400 ₽ и 7.820 кг</w:t>
+              <w:t>Менеджер также рассчитывает сохранённую версию 3: 76400 ₽ и 7.820 кг</w:t>
             </w:r>
           </w:p>
         </w:tc>
@@ -13283,9 +13276,13 @@
       <w:pPr>
         <w:pStyle w:val="2"/>
       </w:pPr>
-      <w:bookmarkStart w:id="27" w:name="_Toc242317340"/>
-      <w:r>
-        <w:t>Изменение данных учебной БД</w:t>
+      <w:bookmarkStart w:id="27" w:name="_Toc244141459"/>
+      <w:r>
+        <w:lastRenderedPageBreak/>
+        <w:t xml:space="preserve">Изменение </w:t>
+      </w:r>
+      <w:r>
+        <w:t>данных учебной БД</w:t>
       </w:r>
       <w:bookmarkEnd w:id="27"/>
     </w:p>
@@ -14518,17 +14515,10 @@
         <w:pStyle w:val="ReportBody"/>
       </w:pPr>
       <w:r>
-        <w:t xml:space="preserve">Добавлены одна версия состава, шесть её позиций и одна ревизия: 48 + 1 + 6 + 1 = 56 записей. </w:t>
-      </w:r>
-      <w:r>
-        <w:t xml:space="preserve">Версия 1 осталась FROZEN, версия 2 — DRAFT; новая версия 3 получила CHECKED. Для карточки U200 новая ревизия 2 относится к версии состава 3 и имеет DRAFT, а ревизия 1 READY сохранена. U200 здесь </w:t>
-      </w:r>
-      <w:r>
-        <w:lastRenderedPageBreak/>
-        <w:t>сокращает UUID 00000000-0000-0000-0000-000000000200, не замен</w:t>
-      </w:r>
-      <w:r>
-        <w:t>яя его тип в БД.</w:t>
+        <w:t xml:space="preserve">Добавлены одна версия состава, шесть её позиций и одна ревизия: 48 + 1 + 6 + 1 = 56 записей. Версия 1 осталась </w:t>
+      </w:r>
+      <w:r>
+        <w:t>FROZEN, версия 2 — DRAFT; новая версия 3 получила CHECKED. Для карточки U200 новая ревизия 2 относится к версии состава 3 и имеет DRAFT, а ревизия 1 READY сохранена. U200 здесь сокращает UUID 00000000-0000-0000-0000-000000000200, не заменяя его тип в БД.</w:t>
       </w:r>
     </w:p>
     <w:p>
@@ -14536,10 +14526,13 @@
         <w:pStyle w:val="ReportBody"/>
       </w:pPr>
       <w:r>
-        <w:t>В сохранённом снимке получены себестоимость 53 500,00 ₽, цена 76 400,00 ₽ и масса 7,820 кг. Эти значения совпали с SQL и видимой выходной формой. Расчёт использует учебные предложения на фиксированный момент 05.10.2026 10:00 +03:00, а не т</w:t>
-      </w:r>
-      <w:r>
-        <w:t>екущие рыночные цены. Единственная исходная попытка publication_attempt осталась ACCEPTED с demo-task-001; новой попытки клиент не создал.</w:t>
+        <w:t>В</w:t>
+      </w:r>
+      <w:r>
+        <w:t xml:space="preserve"> сохранённом снимке получены себестоимость 53 500,00 ₽, цена 76 400,00 ₽ и масса 7,820 кг. Эти значения совпали с SQL и видимой выходной формой. Расчёт использует учебные предложения на фиксированный момент 05.10.2026 10:00 +03:00, а не текущие рыночные це</w:t>
+      </w:r>
+      <w:r>
+        <w:t>ны. Единственная исходная попытка publication_attempt осталась ACCEPTED с demo-task-001; новой попытки клиент не создал.</w:t>
       </w:r>
     </w:p>
     <w:p>
@@ -14547,7 +14540,7 @@
         <w:pStyle w:val="1"/>
         <w:pageBreakBefore/>
       </w:pPr>
-      <w:bookmarkStart w:id="28" w:name="_Toc242317341"/>
+      <w:bookmarkStart w:id="28" w:name="_Toc244141460"/>
       <w:r>
         <w:lastRenderedPageBreak/>
         <w:t>Воспроизведение и ограничения</w:t>
@@ -14558,7 +14551,7 @@
       <w:pPr>
         <w:pStyle w:val="2"/>
       </w:pPr>
-      <w:bookmarkStart w:id="29" w:name="_Toc242317342"/>
+      <w:bookmarkStart w:id="29" w:name="_Toc244141461"/>
       <w:r>
         <w:t>Порядок локального запуска</w:t>
       </w:r>
@@ -14569,13 +14562,13 @@
         <w:pStyle w:val="ReportBody"/>
       </w:pPr>
       <w:r>
-        <w:t xml:space="preserve">Для запуска необходимы Python с psycopg и учебный </w:t>
-      </w:r>
-      <w:r>
-        <w:t xml:space="preserve">PostgreSQL на 127.0.0.1:55432. Настройки соединения хранятся в .cache и не добавляются в Git. Сначала setup_client.py создаёт новую отдельную базу ppois10_* по схеме и тестовым данным №7; существующие базы не удаляются. Затем server.py запускает клиент на </w:t>
-      </w:r>
-      <w:r>
-        <w:t>127.0.0.1:8765. Точные команды и требования к окружению приведены в README каталога «Клиент».</w:t>
+        <w:t xml:space="preserve">Для запуска необходимы Python с psycopg и учебный PostgreSQL на </w:t>
+      </w:r>
+      <w:r>
+        <w:t>127.0.0.1:55432. Настройки соединения хранятся в .cache и не добавляются в Git. Сначала setup_client.py создаёт новую отдельную базу ppois10_* по схеме и тестовым данным №7; существующие базы не удаляются. Затем server.py запускает клиент на 127.0.0.1:8765</w:t>
+      </w:r>
+      <w:r>
+        <w:t>. Точные команды и требования к окружению приведены в README каталога «Клиент».</w:t>
       </w:r>
     </w:p>
     <w:p>
@@ -14583,17 +14576,17 @@
         <w:pStyle w:val="ReportBody"/>
       </w:pPr>
       <w:r>
-        <w:t>Демонстрационные логины: engineer, manager, viewer и admin; общий публичный учебный пароль — coursework-demo. Такой вход предназначен только для локальной проверк</w:t>
-      </w:r>
-      <w:r>
-        <w:t>и, не для эксплуатации. Сеанс действует 30 минут. Тестовый сервер использует отдельную базу; сценарии браузера выполняются в другой базе, чтобы автоматические проверки не переписывали их результаты.</w:t>
+        <w:t>Демонстрационные логины: engineer, manager, viewer и admin; общий публичный учебный пароль — coursework-demo. Такой вход предназначен только для локальной проверки, не для эксп</w:t>
+      </w:r>
+      <w:r>
+        <w:t>луатации. Сеанс действует 30 минут. Тестовый сервер использует отдельную базу; сценарии браузера выполняются в другой базе, чтобы автоматические проверки не переписывали их результаты.</w:t>
       </w:r>
     </w:p>
     <w:p>
       <w:pPr>
         <w:pStyle w:val="2"/>
       </w:pPr>
-      <w:bookmarkStart w:id="30" w:name="_Toc242317343"/>
+      <w:bookmarkStart w:id="30" w:name="_Toc244141462"/>
       <w:r>
         <w:t>Нереализованные и непроверенные возможности</w:t>
       </w:r>
@@ -14604,13 +14597,13 @@
         <w:pStyle w:val="ReportBody"/>
       </w:pPr>
       <w:r>
-        <w:t>Внешний импор</w:t>
-      </w:r>
-      <w:r>
-        <w:t>т и публикация, загрузка изображений, полная проверка атрибутов Ozon и утверждение готовности относятся к следующим итерациям. Подбор проверяет выбранный набор по ограниченным правилам, но не ищет все альтернативные совместимые комбинации. Поэтому отказ по</w:t>
-      </w:r>
-      <w:r>
-        <w:t>дбора не доказывает отсутствие решения во всём каталоге. Проектные пользовательские роли №5 реализованы лишь в объёме описанных функций версии 0.2.</w:t>
+        <w:t>Внешний импорт и публикация</w:t>
+      </w:r>
+      <w:r>
+        <w:t>, загрузка изображений, полная проверка атрибутов Ozon и утверждение готовности относятся к следующим итерациям. Подбор проверяет выбранный набор по ограниченным правилам, но не ищет все альтернативные совместимые комбинации. Поэтому отказ подбора не доказ</w:t>
+      </w:r>
+      <w:r>
+        <w:t>ывает отсутствие решения во всём каталоге. Проектные пользовательские роли №5 реализованы лишь в объёме описанных функций версии 0.2.</w:t>
       </w:r>
     </w:p>
     <w:p>
@@ -14618,17 +14611,17 @@
         <w:pStyle w:val="ReportBody"/>
       </w:pPr>
       <w:r>
-        <w:t>Промышленная аутентификация, TLS, аудит действий, нагрузочная устойчивость, восстановление после отказа и ад</w:t>
-      </w:r>
-      <w:r>
-        <w:t>аптивность на разных устройствах не подтверждаются выполненными проверками. Ограничение loopback и локальные меры контроля не заменяют их. Наличие CSS-правил для разных ширин не выдаётся за завершённое тестирование мобильного интерфейса.</w:t>
+        <w:t xml:space="preserve">Промышленная аутентификация, TLS, аудит действий, нагрузочная устойчивость, восстановление после отказа и адаптивность на </w:t>
+      </w:r>
+      <w:r>
+        <w:t>разных устройствах не подтверждаются выполненными проверками. Ограничение loopback и локальные меры контроля не заменяют их. Наличие CSS-правил для разных ширин не выдаётся за завершённое тестирование мобильного интерфейса.</w:t>
       </w:r>
     </w:p>
     <w:p>
       <w:pPr>
         <w:pStyle w:val="1"/>
       </w:pPr>
-      <w:bookmarkStart w:id="31" w:name="_Toc242317344"/>
+      <w:bookmarkStart w:id="31" w:name="_Toc244141463"/>
       <w:r>
         <w:lastRenderedPageBreak/>
         <w:t>Вывод</w:t>
@@ -14640,20 +14633,20 @@
         <w:pStyle w:val="ReportBody"/>
       </w:pPr>
       <w:r>
-        <w:t>Выполнены об</w:t>
-      </w:r>
-      <w:r>
-        <w:t xml:space="preserve">а задания: построено дерево основных и служебных функций с представлениями четырёх ролей, описаны сценарии диалога и разработана структурная схема модулей. Их соответствие реализованному клиенту проверено через HTTP, браузер и PostgreSQL. Клиент сохраняет </w:t>
-      </w:r>
-      <w:r>
-        <w:t>историю версий, показывает причины ошибок и воспроизводимый расчёт; новая расчётная ревизия не смешивается с готовностью к внешней публикации.</w:t>
+        <w:t>Выполнены оба задания: пос</w:t>
+      </w:r>
+      <w:r>
+        <w:t>троено дерево основных и служебных функций с представлениями четырёх ролей, описаны сценарии диалога и разработана структурная схема модулей. Их соответствие реализованному клиенту проверено через HTTP, браузер и PostgreSQL. Клиент сохраняет историю версий</w:t>
+      </w:r>
+      <w:r>
+        <w:t>, показывает причины ошибок и воспроизводимый расчёт; новая расчётная ревизия не смешивается с готовностью к внешней публикации.</w:t>
       </w:r>
     </w:p>
     <w:p>
       <w:pPr>
         <w:pStyle w:val="1"/>
       </w:pPr>
-      <w:bookmarkStart w:id="32" w:name="_Toc242317345"/>
+      <w:bookmarkStart w:id="32" w:name="_Toc244141464"/>
       <w:r>
         <w:t>Список использованных источников</w:t>
       </w:r>
@@ -14665,10 +14658,10 @@
         <w:keepLines/>
       </w:pPr>
       <w:r>
-        <w:t xml:space="preserve">1. Проектирование предметно-ориентированных информационных систем. Практическая </w:t>
-      </w:r>
-      <w:r>
-        <w:t>работа №10 «Описание реализации клиентской части ИС». Методические материалы, 3 с. Локальный PDF задания.</w:t>
+        <w:t>1. Проектирование предметно-ориентированных информационных систем. Практическая работа №10 «Оп</w:t>
+      </w:r>
+      <w:r>
+        <w:t>исание реализации клиентской части ИС». Методические материалы, 3 с. Локальный PDF задания.</w:t>
       </w:r>
     </w:p>
     <w:p>
@@ -14686,10 +14679,10 @@
         <w:keepLines/>
       </w:pPr>
       <w:r>
-        <w:t>3. Албахтин И.В. ППОИС. Практическая раб</w:t>
-      </w:r>
-      <w:r>
-        <w:t>ота №7. Концептуальная, логическая и физическая модели, тестовые данные и выполненные SQL. 2026.</w:t>
+        <w:t>3. Албахтин И.В. ППОИС. Практическая работа №7. Концеп</w:t>
+      </w:r>
+      <w:r>
+        <w:t>туальная, логическая и физическая модели, тестовые данные и выполненные SQL. 2026.</w:t>
       </w:r>
     </w:p>
     <w:p>
@@ -14707,10 +14700,10 @@
         <w:keepLines/>
       </w:pPr>
       <w:r>
-        <w:t>5. Учебный клиент версии 0.2. client_contract.json, client.html, c</w:t>
-      </w:r>
-      <w:r>
-        <w:t>lient.css, client.js и server.py. Каталог «Клиент» комплекта ППОИС. Состояние на 08.10.2026.</w:t>
+        <w:t>5. Учебный клиент версии 0.2. client_contract.json, client.html, client.css, cli</w:t>
+      </w:r>
+      <w:r>
+        <w:t>ent.js и server.py. Каталог «Клиент» комплекта ППОИС. Состояние на 08.10.2026.</w:t>
       </w:r>
     </w:p>
     <w:p>
@@ -14719,17 +14712,17 @@
         <w:keepLines/>
       </w:pPr>
       <w:r>
-        <w:t xml:space="preserve">6. Результаты локальной проверки клиента от 08.10.2026: 28 HTTP-тестов, 18 браузерных контрольных точек и 111 сверок с SQL и исходниками. Каталог </w:t>
-      </w:r>
-      <w:r>
-        <w:t>«Клиент/Результаты_проверки.json».</w:t>
+        <w:t>6. Результаты локальной проверки клиента от 08.10.2026: 28 HTTP-тестов, 18 браузерных контрольных точек и 111 сверок с SQL и исходниками. Каталог «Клиент/Результаты_проверки.jso</w:t>
+      </w:r>
+      <w:r>
+        <w:t>n».</w:t>
       </w:r>
     </w:p>
     <w:sectPr>
-      <w:headerReference w:type="default" r:id="rId50"/>
-      <w:footerReference w:type="default" r:id="rId51"/>
-      <w:headerReference w:type="first" r:id="rId52"/>
-      <w:footerReference w:type="first" r:id="rId53"/>
+      <w:headerReference w:type="default" r:id="rId42"/>
+      <w:footerReference w:type="default" r:id="rId43"/>
+      <w:headerReference w:type="first" r:id="rId44"/>
+      <w:footerReference w:type="first" r:id="rId45"/>
       <w:pgSz w:w="11906" w:h="16838"/>
       <w:pgMar w:top="1134" w:right="850" w:bottom="1134" w:left="1701" w:header="454" w:footer="567" w:gutter="0"/>
       <w:cols w:space="720"/>
@@ -14831,68 +14824,6 @@
 </file>
 
 <file path=word/footer13.xml><?xml version="1.0" encoding="utf-8"?>
-<w:ftr xmlns:wpc="http://schemas.microsoft.com/office/word/2010/wordprocessingCanvas" xmlns:cx="http://schemas.microsoft.com/office/drawing/2014/chartex" xmlns:cx1="http://schemas.microsoft.com/office/drawing/2015/9/8/chartex" xmlns:cx2="http://schemas.microsoft.com/office/drawing/2015/10/21/chartex" xmlns:cx3="http://schemas.microsoft.com/office/drawing/2016/5/9/chartex" xmlns:cx4="http://schemas.microsoft.com/office/drawing/2016/5/10/chartex" xmlns:cx5="http://schemas.microsoft.com/office/drawing/2016/5/11/chartex" xmlns:cx6="http://schemas.microsoft.com/office/drawing/2016/5/12/chartex" xmlns:cx7="http://schemas.microsoft.com/office/drawing/2016/5/13/chartex" xmlns:cx8="http://schemas.microsoft.com/office/drawing/2016/5/14/chartex" xmlns:mc="http://schemas.openxmlformats.org/markup-compatibility/2006" xmlns:aink="http://schemas.microsoft.com/office/drawing/2016/ink" xmlns:am3d="http://schemas.microsoft.com/office/drawing/2017/model3d" xmlns:o="urn:schemas-microsoft-com:office:office" xmlns:r="http://schemas.openxmlformats.org/officeDocument/2006/relationships" xmlns:m="http://schemas.openxmlformats.org/officeDocument/2006/math" xmlns:v="urn:schemas-microsoft-com:vml" xmlns:wp14="http://schemas.microsoft.com/office/word/2010/wordprocessingDrawing" xmlns:wp="http://schemas.openxmlformats.org/drawingml/2006/wordprocessingDrawing" xmlns:w10="urn:schemas-microsoft-com:office:word" xmlns:w="http://schemas.openxmlformats.org/wordprocessingml/2006/main" xmlns:w14="http://schemas.microsoft.com/office/word/2010/wordml" xmlns:w15="http://schemas.microsoft.com/office/word/2012/wordml" xmlns:w16cex="http://schemas.microsoft.com/office/word/2018/wordml/cex" xmlns:w16cid="http://schemas.microsoft.com/office/word/2016/wordml/cid" xmlns:w16="http://schemas.microsoft.com/office/word/2018/wordml" xmlns:w16sdtdh="http://schemas.microsoft.com/office/word/2020/wordml/sdtdatahash" xmlns:w16se="http://schemas.microsoft.com/office/word/2015/wordml/symex" xmlns:wpg="http://schemas.microsoft.com/office/word/2010/wordprocessingGroup" xmlns:wpi="http://schemas.microsoft.com/office/word/2010/wordprocessingInk" xmlns:wne="http://schemas.microsoft.com/office/word/2006/wordml" xmlns:wps="http://schemas.microsoft.com/office/word/2010/wordprocessingShape" mc:Ignorable="w14 w15 w16se w16cid w16 w16cex w16sdtdh wp14">
-  <w:p/>
-</w:ftr>
-</file>
-
-<file path=word/footer14.xml><?xml version="1.0" encoding="utf-8"?>
-<w:ftr xmlns:wpc="http://schemas.microsoft.com/office/word/2010/wordprocessingCanvas" xmlns:cx="http://schemas.microsoft.com/office/drawing/2014/chartex" xmlns:cx1="http://schemas.microsoft.com/office/drawing/2015/9/8/chartex" xmlns:cx2="http://schemas.microsoft.com/office/drawing/2015/10/21/chartex" xmlns:cx3="http://schemas.microsoft.com/office/drawing/2016/5/9/chartex" xmlns:cx4="http://schemas.microsoft.com/office/drawing/2016/5/10/chartex" xmlns:cx5="http://schemas.microsoft.com/office/drawing/2016/5/11/chartex" xmlns:cx6="http://schemas.microsoft.com/office/drawing/2016/5/12/chartex" xmlns:cx7="http://schemas.microsoft.com/office/drawing/2016/5/13/chartex" xmlns:cx8="http://schemas.microsoft.com/office/drawing/2016/5/14/chartex" xmlns:mc="http://schemas.openxmlformats.org/markup-compatibility/2006" xmlns:aink="http://schemas.microsoft.com/office/drawing/2016/ink" xmlns:am3d="http://schemas.microsoft.com/office/drawing/2017/model3d" xmlns:o="urn:schemas-microsoft-com:office:office" xmlns:r="http://schemas.openxmlformats.org/officeDocument/2006/relationships" xmlns:m="http://schemas.openxmlformats.org/officeDocument/2006/math" xmlns:v="urn:schemas-microsoft-com:vml" xmlns:wp14="http://schemas.microsoft.com/office/word/2010/wordprocessingDrawing" xmlns:wp="http://schemas.openxmlformats.org/drawingml/2006/wordprocessingDrawing" xmlns:w10="urn:schemas-microsoft-com:office:word" xmlns:w="http://schemas.openxmlformats.org/wordprocessingml/2006/main" xmlns:w14="http://schemas.microsoft.com/office/word/2010/wordml" xmlns:w15="http://schemas.microsoft.com/office/word/2012/wordml" xmlns:w16cex="http://schemas.microsoft.com/office/word/2018/wordml/cex" xmlns:w16cid="http://schemas.microsoft.com/office/word/2016/wordml/cid" xmlns:w16="http://schemas.microsoft.com/office/word/2018/wordml" xmlns:w16sdtdh="http://schemas.microsoft.com/office/word/2020/wordml/sdtdatahash" xmlns:w16se="http://schemas.microsoft.com/office/word/2015/wordml/symex" xmlns:wpg="http://schemas.microsoft.com/office/word/2010/wordprocessingGroup" xmlns:wpi="http://schemas.microsoft.com/office/word/2010/wordprocessingInk" xmlns:wne="http://schemas.microsoft.com/office/word/2006/wordml" xmlns:wps="http://schemas.microsoft.com/office/word/2010/wordprocessingShape" mc:Ignorable="w14 w15 w16se w16cid w16 w16cex w16sdtdh wp14">
-  <w:p>
-    <w:pPr>
-      <w:pStyle w:val="ReportFooter"/>
-    </w:pPr>
-    <w:r>
-      <w:fldChar w:fldCharType="begin"/>
-    </w:r>
-    <w:r>
-      <w:instrText xml:space="preserve"> PAGE </w:instrText>
-    </w:r>
-    <w:r>
-      <w:fldChar w:fldCharType="separate"/>
-    </w:r>
-    <w:r>
-      <w:t>2</w:t>
-    </w:r>
-    <w:r>
-      <w:fldChar w:fldCharType="end"/>
-    </w:r>
-  </w:p>
-</w:ftr>
-</file>
-
-<file path=word/footer15.xml><?xml version="1.0" encoding="utf-8"?>
-<w:ftr xmlns:wpc="http://schemas.microsoft.com/office/word/2010/wordprocessingCanvas" xmlns:cx="http://schemas.microsoft.com/office/drawing/2014/chartex" xmlns:cx1="http://schemas.microsoft.com/office/drawing/2015/9/8/chartex" xmlns:cx2="http://schemas.microsoft.com/office/drawing/2015/10/21/chartex" xmlns:cx3="http://schemas.microsoft.com/office/drawing/2016/5/9/chartex" xmlns:cx4="http://schemas.microsoft.com/office/drawing/2016/5/10/chartex" xmlns:cx5="http://schemas.microsoft.com/office/drawing/2016/5/11/chartex" xmlns:cx6="http://schemas.microsoft.com/office/drawing/2016/5/12/chartex" xmlns:cx7="http://schemas.microsoft.com/office/drawing/2016/5/13/chartex" xmlns:cx8="http://schemas.microsoft.com/office/drawing/2016/5/14/chartex" xmlns:mc="http://schemas.openxmlformats.org/markup-compatibility/2006" xmlns:aink="http://schemas.microsoft.com/office/drawing/2016/ink" xmlns:am3d="http://schemas.microsoft.com/office/drawing/2017/model3d" xmlns:o="urn:schemas-microsoft-com:office:office" xmlns:r="http://schemas.openxmlformats.org/officeDocument/2006/relationships" xmlns:m="http://schemas.openxmlformats.org/officeDocument/2006/math" xmlns:v="urn:schemas-microsoft-com:vml" xmlns:wp14="http://schemas.microsoft.com/office/word/2010/wordprocessingDrawing" xmlns:wp="http://schemas.openxmlformats.org/drawingml/2006/wordprocessingDrawing" xmlns:w10="urn:schemas-microsoft-com:office:word" xmlns:w="http://schemas.openxmlformats.org/wordprocessingml/2006/main" xmlns:w14="http://schemas.microsoft.com/office/word/2010/wordml" xmlns:w15="http://schemas.microsoft.com/office/word/2012/wordml" xmlns:w16cex="http://schemas.microsoft.com/office/word/2018/wordml/cex" xmlns:w16cid="http://schemas.microsoft.com/office/word/2016/wordml/cid" xmlns:w16="http://schemas.microsoft.com/office/word/2018/wordml" xmlns:w16sdtdh="http://schemas.microsoft.com/office/word/2020/wordml/sdtdatahash" xmlns:w16se="http://schemas.microsoft.com/office/word/2015/wordml/symex" xmlns:wpg="http://schemas.microsoft.com/office/word/2010/wordprocessingGroup" xmlns:wpi="http://schemas.microsoft.com/office/word/2010/wordprocessingInk" xmlns:wne="http://schemas.microsoft.com/office/word/2006/wordml" xmlns:wps="http://schemas.microsoft.com/office/word/2010/wordprocessingShape" mc:Ignorable="w14 w15 w16se w16cid w16 w16cex w16sdtdh wp14">
-  <w:p/>
-</w:ftr>
-</file>
-
-<file path=word/footer16.xml><?xml version="1.0" encoding="utf-8"?>
-<w:ftr xmlns:wpc="http://schemas.microsoft.com/office/word/2010/wordprocessingCanvas" xmlns:cx="http://schemas.microsoft.com/office/drawing/2014/chartex" xmlns:cx1="http://schemas.microsoft.com/office/drawing/2015/9/8/chartex" xmlns:cx2="http://schemas.microsoft.com/office/drawing/2015/10/21/chartex" xmlns:cx3="http://schemas.microsoft.com/office/drawing/2016/5/9/chartex" xmlns:cx4="http://schemas.microsoft.com/office/drawing/2016/5/10/chartex" xmlns:cx5="http://schemas.microsoft.com/office/drawing/2016/5/11/chartex" xmlns:cx6="http://schemas.microsoft.com/office/drawing/2016/5/12/chartex" xmlns:cx7="http://schemas.microsoft.com/office/drawing/2016/5/13/chartex" xmlns:cx8="http://schemas.microsoft.com/office/drawing/2016/5/14/chartex" xmlns:mc="http://schemas.openxmlformats.org/markup-compatibility/2006" xmlns:aink="http://schemas.microsoft.com/office/drawing/2016/ink" xmlns:am3d="http://schemas.microsoft.com/office/drawing/2017/model3d" xmlns:o="urn:schemas-microsoft-com:office:office" xmlns:r="http://schemas.openxmlformats.org/officeDocument/2006/relationships" xmlns:m="http://schemas.openxmlformats.org/officeDocument/2006/math" xmlns:v="urn:schemas-microsoft-com:vml" xmlns:wp14="http://schemas.microsoft.com/office/word/2010/wordprocessingDrawing" xmlns:wp="http://schemas.openxmlformats.org/drawingml/2006/wordprocessingDrawing" xmlns:w10="urn:schemas-microsoft-com:office:word" xmlns:w="http://schemas.openxmlformats.org/wordprocessingml/2006/main" xmlns:w14="http://schemas.microsoft.com/office/word/2010/wordml" xmlns:w15="http://schemas.microsoft.com/office/word/2012/wordml" xmlns:w16cex="http://schemas.microsoft.com/office/word/2018/wordml/cex" xmlns:w16cid="http://schemas.microsoft.com/office/word/2016/wordml/cid" xmlns:w16="http://schemas.microsoft.com/office/word/2018/wordml" xmlns:w16sdtdh="http://schemas.microsoft.com/office/word/2020/wordml/sdtdatahash" xmlns:w16se="http://schemas.microsoft.com/office/word/2015/wordml/symex" xmlns:wpg="http://schemas.microsoft.com/office/word/2010/wordprocessingGroup" xmlns:wpi="http://schemas.microsoft.com/office/word/2010/wordprocessingInk" xmlns:wne="http://schemas.microsoft.com/office/word/2006/wordml" xmlns:wps="http://schemas.microsoft.com/office/word/2010/wordprocessingShape" mc:Ignorable="w14 w15 w16se w16cid w16 w16cex w16sdtdh wp14">
-  <w:p>
-    <w:pPr>
-      <w:pStyle w:val="ReportFooter"/>
-    </w:pPr>
-    <w:r>
-      <w:fldChar w:fldCharType="begin"/>
-    </w:r>
-    <w:r>
-      <w:instrText xml:space="preserve"> PAGE </w:instrText>
-    </w:r>
-    <w:r>
-      <w:fldChar w:fldCharType="separate"/>
-    </w:r>
-    <w:r>
-      <w:t>2</w:t>
-    </w:r>
-    <w:r>
-      <w:fldChar w:fldCharType="end"/>
-    </w:r>
-  </w:p>
-</w:ftr>
-</file>
-
-<file path=word/footer17.xml><?xml version="1.0" encoding="utf-8"?>
 <w:ftr xmlns:wpc="http://schemas.microsoft.com/office/word/2010/wordprocessingCanvas" xmlns:cx="http://schemas.microsoft.com/office/drawing/2014/chartex" xmlns:cx1="http://schemas.microsoft.com/office/drawing/2015/9/8/chartex" xmlns:cx2="http://schemas.microsoft.com/office/drawing/2015/10/21/chartex" xmlns:cx3="http://schemas.microsoft.com/office/drawing/2016/5/9/chartex" xmlns:cx4="http://schemas.microsoft.com/office/drawing/2016/5/10/chartex" xmlns:cx5="http://schemas.microsoft.com/office/drawing/2016/5/11/chartex" xmlns:cx6="http://schemas.microsoft.com/office/drawing/2016/5/12/chartex" xmlns:cx7="http://schemas.microsoft.com/office/drawing/2016/5/13/chartex" xmlns:cx8="http://schemas.microsoft.com/office/drawing/2016/5/14/chartex" xmlns:mc="http://schemas.openxmlformats.org/markup-compatibility/2006" xmlns:aink="http://schemas.microsoft.com/office/drawing/2016/ink" xmlns:am3d="http://schemas.microsoft.com/office/drawing/2017/model3d" xmlns:o="urn:schemas-microsoft-com:office:office" xmlns:r="http://schemas.openxmlformats.org/officeDocument/2006/relationships" xmlns:m="http://schemas.openxmlformats.org/officeDocument/2006/math" xmlns:v="urn:schemas-microsoft-com:vml" xmlns:wp14="http://schemas.microsoft.com/office/word/2010/wordprocessingDrawing" xmlns:wp="http://schemas.openxmlformats.org/drawingml/2006/wordprocessingDrawing" xmlns:w10="urn:schemas-microsoft-com:office:word" xmlns:w="http://schemas.openxmlformats.org/wordprocessingml/2006/main" xmlns:w14="http://schemas.microsoft.com/office/word/2010/wordml" xmlns:w15="http://schemas.microsoft.com/office/word/2012/wordml" xmlns:w16cex="http://schemas.microsoft.com/office/word/2018/wordml/cex" xmlns:w16cid="http://schemas.microsoft.com/office/word/2016/wordml/cid" xmlns:w16="http://schemas.microsoft.com/office/word/2018/wordml" xmlns:w16sdtdh="http://schemas.microsoft.com/office/word/2020/wordml/sdtdatahash" xmlns:w16se="http://schemas.microsoft.com/office/word/2015/wordml/symex" xmlns:wpg="http://schemas.microsoft.com/office/word/2010/wordprocessingGroup" xmlns:wpi="http://schemas.microsoft.com/office/word/2010/wordprocessingInk" xmlns:wne="http://schemas.microsoft.com/office/word/2006/wordml" xmlns:wps="http://schemas.microsoft.com/office/word/2010/wordprocessingShape" mc:Ignorable="w14 w15 w16se w16cid w16 w16cex w16sdtdh wp14">
   <w:p/>
 </w:ftr>
@@ -15061,30 +14992,6 @@
 </file>
 
 <file path=word/header13.xml><?xml version="1.0" encoding="utf-8"?>
-<w:hdr xmlns:wpc="http://schemas.microsoft.com/office/word/2010/wordprocessingCanvas" xmlns:cx="http://schemas.microsoft.com/office/drawing/2014/chartex" xmlns:cx1="http://schemas.microsoft.com/office/drawing/2015/9/8/chartex" xmlns:cx2="http://schemas.microsoft.com/office/drawing/2015/10/21/chartex" xmlns:cx3="http://schemas.microsoft.com/office/drawing/2016/5/9/chartex" xmlns:cx4="http://schemas.microsoft.com/office/drawing/2016/5/10/chartex" xmlns:cx5="http://schemas.microsoft.com/office/drawing/2016/5/11/chartex" xmlns:cx6="http://schemas.microsoft.com/office/drawing/2016/5/12/chartex" xmlns:cx7="http://schemas.microsoft.com/office/drawing/2016/5/13/chartex" xmlns:cx8="http://schemas.microsoft.com/office/drawing/2016/5/14/chartex" xmlns:mc="http://schemas.openxmlformats.org/markup-compatibility/2006" xmlns:aink="http://schemas.microsoft.com/office/drawing/2016/ink" xmlns:am3d="http://schemas.microsoft.com/office/drawing/2017/model3d" xmlns:o="urn:schemas-microsoft-com:office:office" xmlns:r="http://schemas.openxmlformats.org/officeDocument/2006/relationships" xmlns:m="http://schemas.openxmlformats.org/officeDocument/2006/math" xmlns:v="urn:schemas-microsoft-com:vml" xmlns:wp14="http://schemas.microsoft.com/office/word/2010/wordprocessingDrawing" xmlns:wp="http://schemas.openxmlformats.org/drawingml/2006/wordprocessingDrawing" xmlns:w10="urn:schemas-microsoft-com:office:word" xmlns:w="http://schemas.openxmlformats.org/wordprocessingml/2006/main" xmlns:w14="http://schemas.microsoft.com/office/word/2010/wordml" xmlns:w15="http://schemas.microsoft.com/office/word/2012/wordml" xmlns:w16cex="http://schemas.microsoft.com/office/word/2018/wordml/cex" xmlns:w16cid="http://schemas.microsoft.com/office/word/2016/wordml/cid" xmlns:w16="http://schemas.microsoft.com/office/word/2018/wordml" xmlns:w16sdtdh="http://schemas.microsoft.com/office/word/2020/wordml/sdtdatahash" xmlns:w16se="http://schemas.microsoft.com/office/word/2015/wordml/symex" xmlns:wpg="http://schemas.microsoft.com/office/word/2010/wordprocessingGroup" xmlns:wpi="http://schemas.microsoft.com/office/word/2010/wordprocessingInk" xmlns:wne="http://schemas.microsoft.com/office/word/2006/wordml" xmlns:wps="http://schemas.microsoft.com/office/word/2010/wordprocessingShape" mc:Ignorable="w14 w15 w16se w16cid w16 w16cex w16sdtdh wp14">
-  <w:p/>
-</w:hdr>
-</file>
-
-<file path=word/header14.xml><?xml version="1.0" encoding="utf-8"?>
-<w:hdr xmlns:wpc="http://schemas.microsoft.com/office/word/2010/wordprocessingCanvas" xmlns:cx="http://schemas.microsoft.com/office/drawing/2014/chartex" xmlns:cx1="http://schemas.microsoft.com/office/drawing/2015/9/8/chartex" xmlns:cx2="http://schemas.microsoft.com/office/drawing/2015/10/21/chartex" xmlns:cx3="http://schemas.microsoft.com/office/drawing/2016/5/9/chartex" xmlns:cx4="http://schemas.microsoft.com/office/drawing/2016/5/10/chartex" xmlns:cx5="http://schemas.microsoft.com/office/drawing/2016/5/11/chartex" xmlns:cx6="http://schemas.microsoft.com/office/drawing/2016/5/12/chartex" xmlns:cx7="http://schemas.microsoft.com/office/drawing/2016/5/13/chartex" xmlns:cx8="http://schemas.microsoft.com/office/drawing/2016/5/14/chartex" xmlns:mc="http://schemas.openxmlformats.org/markup-compatibility/2006" xmlns:aink="http://schemas.microsoft.com/office/drawing/2016/ink" xmlns:am3d="http://schemas.microsoft.com/office/drawing/2017/model3d" xmlns:o="urn:schemas-microsoft-com:office:office" xmlns:r="http://schemas.openxmlformats.org/officeDocument/2006/relationships" xmlns:m="http://schemas.openxmlformats.org/officeDocument/2006/math" xmlns:v="urn:schemas-microsoft-com:vml" xmlns:wp14="http://schemas.microsoft.com/office/word/2010/wordprocessingDrawing" xmlns:wp="http://schemas.openxmlformats.org/drawingml/2006/wordprocessingDrawing" xmlns:w10="urn:schemas-microsoft-com:office:word" xmlns:w="http://schemas.openxmlformats.org/wordprocessingml/2006/main" xmlns:w14="http://schemas.microsoft.com/office/word/2010/wordml" xmlns:w15="http://schemas.microsoft.com/office/word/2012/wordml" xmlns:w16cex="http://schemas.microsoft.com/office/word/2018/wordml/cex" xmlns:w16cid="http://schemas.microsoft.com/office/word/2016/wordml/cid" xmlns:w16="http://schemas.microsoft.com/office/word/2018/wordml" xmlns:w16sdtdh="http://schemas.microsoft.com/office/word/2020/wordml/sdtdatahash" xmlns:w16se="http://schemas.microsoft.com/office/word/2015/wordml/symex" xmlns:wpg="http://schemas.microsoft.com/office/word/2010/wordprocessingGroup" xmlns:wpi="http://schemas.microsoft.com/office/word/2010/wordprocessingInk" xmlns:wne="http://schemas.microsoft.com/office/word/2006/wordml" xmlns:wps="http://schemas.microsoft.com/office/word/2010/wordprocessingShape" mc:Ignorable="w14 w15 w16se w16cid w16 w16cex w16sdtdh wp14">
-  <w:p/>
-</w:hdr>
-</file>
-
-<file path=word/header15.xml><?xml version="1.0" encoding="utf-8"?>
-<w:hdr xmlns:wpc="http://schemas.microsoft.com/office/word/2010/wordprocessingCanvas" xmlns:cx="http://schemas.microsoft.com/office/drawing/2014/chartex" xmlns:cx1="http://schemas.microsoft.com/office/drawing/2015/9/8/chartex" xmlns:cx2="http://schemas.microsoft.com/office/drawing/2015/10/21/chartex" xmlns:cx3="http://schemas.microsoft.com/office/drawing/2016/5/9/chartex" xmlns:cx4="http://schemas.microsoft.com/office/drawing/2016/5/10/chartex" xmlns:cx5="http://schemas.microsoft.com/office/drawing/2016/5/11/chartex" xmlns:cx6="http://schemas.microsoft.com/office/drawing/2016/5/12/chartex" xmlns:cx7="http://schemas.microsoft.com/office/drawing/2016/5/13/chartex" xmlns:cx8="http://schemas.microsoft.com/office/drawing/2016/5/14/chartex" xmlns:mc="http://schemas.openxmlformats.org/markup-compatibility/2006" xmlns:aink="http://schemas.microsoft.com/office/drawing/2016/ink" xmlns:am3d="http://schemas.microsoft.com/office/drawing/2017/model3d" xmlns:o="urn:schemas-microsoft-com:office:office" xmlns:r="http://schemas.openxmlformats.org/officeDocument/2006/relationships" xmlns:m="http://schemas.openxmlformats.org/officeDocument/2006/math" xmlns:v="urn:schemas-microsoft-com:vml" xmlns:wp14="http://schemas.microsoft.com/office/word/2010/wordprocessingDrawing" xmlns:wp="http://schemas.openxmlformats.org/drawingml/2006/wordprocessingDrawing" xmlns:w10="urn:schemas-microsoft-com:office:word" xmlns:w="http://schemas.openxmlformats.org/wordprocessingml/2006/main" xmlns:w14="http://schemas.microsoft.com/office/word/2010/wordml" xmlns:w15="http://schemas.microsoft.com/office/word/2012/wordml" xmlns:w16cex="http://schemas.microsoft.com/office/word/2018/wordml/cex" xmlns:w16cid="http://schemas.microsoft.com/office/word/2016/wordml/cid" xmlns:w16="http://schemas.microsoft.com/office/word/2018/wordml" xmlns:w16sdtdh="http://schemas.microsoft.com/office/word/2020/wordml/sdtdatahash" xmlns:w16se="http://schemas.microsoft.com/office/word/2015/wordml/symex" xmlns:wpg="http://schemas.microsoft.com/office/word/2010/wordprocessingGroup" xmlns:wpi="http://schemas.microsoft.com/office/word/2010/wordprocessingInk" xmlns:wne="http://schemas.microsoft.com/office/word/2006/wordml" xmlns:wps="http://schemas.microsoft.com/office/word/2010/wordprocessingShape" mc:Ignorable="w14 w15 w16se w16cid w16 w16cex w16sdtdh wp14">
-  <w:p/>
-</w:hdr>
-</file>
-
-<file path=word/header16.xml><?xml version="1.0" encoding="utf-8"?>
-<w:hdr xmlns:wpc="http://schemas.microsoft.com/office/word/2010/wordprocessingCanvas" xmlns:cx="http://schemas.microsoft.com/office/drawing/2014/chartex" xmlns:cx1="http://schemas.microsoft.com/office/drawing/2015/9/8/chartex" xmlns:cx2="http://schemas.microsoft.com/office/drawing/2015/10/21/chartex" xmlns:cx3="http://schemas.microsoft.com/office/drawing/2016/5/9/chartex" xmlns:cx4="http://schemas.microsoft.com/office/drawing/2016/5/10/chartex" xmlns:cx5="http://schemas.microsoft.com/office/drawing/2016/5/11/chartex" xmlns:cx6="http://schemas.microsoft.com/office/drawing/2016/5/12/chartex" xmlns:cx7="http://schemas.microsoft.com/office/drawing/2016/5/13/chartex" xmlns:cx8="http://schemas.microsoft.com/office/drawing/2016/5/14/chartex" xmlns:mc="http://schemas.openxmlformats.org/markup-compatibility/2006" xmlns:aink="http://schemas.microsoft.com/office/drawing/2016/ink" xmlns:am3d="http://schemas.microsoft.com/office/drawing/2017/model3d" xmlns:o="urn:schemas-microsoft-com:office:office" xmlns:r="http://schemas.openxmlformats.org/officeDocument/2006/relationships" xmlns:m="http://schemas.openxmlformats.org/officeDocument/2006/math" xmlns:v="urn:schemas-microsoft-com:vml" xmlns:wp14="http://schemas.microsoft.com/office/word/2010/wordprocessingDrawing" xmlns:wp="http://schemas.openxmlformats.org/drawingml/2006/wordprocessingDrawing" xmlns:w10="urn:schemas-microsoft-com:office:word" xmlns:w="http://schemas.openxmlformats.org/wordprocessingml/2006/main" xmlns:w14="http://schemas.microsoft.com/office/word/2010/wordml" xmlns:w15="http://schemas.microsoft.com/office/word/2012/wordml" xmlns:w16cex="http://schemas.microsoft.com/office/word/2018/wordml/cex" xmlns:w16cid="http://schemas.microsoft.com/office/word/2016/wordml/cid" xmlns:w16="http://schemas.microsoft.com/office/word/2018/wordml" xmlns:w16sdtdh="http://schemas.microsoft.com/office/word/2020/wordml/sdtdatahash" xmlns:w16se="http://schemas.microsoft.com/office/word/2015/wordml/symex" xmlns:wpg="http://schemas.microsoft.com/office/word/2010/wordprocessingGroup" xmlns:wpi="http://schemas.microsoft.com/office/word/2010/wordprocessingInk" xmlns:wne="http://schemas.microsoft.com/office/word/2006/wordml" xmlns:wps="http://schemas.microsoft.com/office/word/2010/wordprocessingShape" mc:Ignorable="w14 w15 w16se w16cid w16 w16cex w16sdtdh wp14">
-  <w:p/>
-</w:hdr>
-</file>
-
-<file path=word/header17.xml><?xml version="1.0" encoding="utf-8"?>
 <w:hdr xmlns:wpc="http://schemas.microsoft.com/office/word/2010/wordprocessingCanvas" xmlns:cx="http://schemas.microsoft.com/office/drawing/2014/chartex" xmlns:cx1="http://schemas.microsoft.com/office/drawing/2015/9/8/chartex" xmlns:cx2="http://schemas.microsoft.com/office/drawing/2015/10/21/chartex" xmlns:cx3="http://schemas.microsoft.com/office/drawing/2016/5/9/chartex" xmlns:cx4="http://schemas.microsoft.com/office/drawing/2016/5/10/chartex" xmlns:cx5="http://schemas.microsoft.com/office/drawing/2016/5/11/chartex" xmlns:cx6="http://schemas.microsoft.com/office/drawing/2016/5/12/chartex" xmlns:cx7="http://schemas.microsoft.com/office/drawing/2016/5/13/chartex" xmlns:cx8="http://schemas.microsoft.com/office/drawing/2016/5/14/chartex" xmlns:mc="http://schemas.openxmlformats.org/markup-compatibility/2006" xmlns:aink="http://schemas.microsoft.com/office/drawing/2016/ink" xmlns:am3d="http://schemas.microsoft.com/office/drawing/2017/model3d" xmlns:o="urn:schemas-microsoft-com:office:office" xmlns:r="http://schemas.openxmlformats.org/officeDocument/2006/relationships" xmlns:m="http://schemas.openxmlformats.org/officeDocument/2006/math" xmlns:v="urn:schemas-microsoft-com:vml" xmlns:wp14="http://schemas.microsoft.com/office/word/2010/wordprocessingDrawing" xmlns:wp="http://schemas.openxmlformats.org/drawingml/2006/wordprocessingDrawing" xmlns:w10="urn:schemas-microsoft-com:office:word" xmlns:w="http://schemas.openxmlformats.org/wordprocessingml/2006/main" xmlns:w14="http://schemas.microsoft.com/office/word/2010/wordml" xmlns:w15="http://schemas.microsoft.com/office/word/2012/wordml" xmlns:w16cex="http://schemas.microsoft.com/office/word/2018/wordml/cex" xmlns:w16cid="http://schemas.microsoft.com/office/word/2016/wordml/cid" xmlns:w16="http://schemas.microsoft.com/office/word/2018/wordml" xmlns:w16sdtdh="http://schemas.microsoft.com/office/word/2020/wordml/sdtdatahash" xmlns:w16se="http://schemas.microsoft.com/office/word/2015/wordml/symex" xmlns:wpg="http://schemas.microsoft.com/office/word/2010/wordprocessingGroup" xmlns:wpi="http://schemas.microsoft.com/office/word/2010/wordprocessingInk" xmlns:wne="http://schemas.microsoft.com/office/word/2006/wordml" xmlns:wps="http://schemas.microsoft.com/office/word/2010/wordprocessingShape" mc:Ignorable="w14 w15 w16se w16cid w16 w16cex w16sdtdh wp14">
   <w:p/>
 </w:hdr>
@@ -16019,7 +15926,7 @@
     <w:basedOn w:val="a0"/>
     <w:uiPriority w:val="99"/>
     <w:unhideWhenUsed/>
-    <w:rsid w:val="00D677A3"/>
+    <w:rsid w:val="00C063E0"/>
     <w:rPr>
       <w:color w:val="467886" w:themeColor="hyperlink"/>
       <w:u w:val="single"/>
@@ -16031,7 +15938,7 @@
     <w:link w:val="a6"/>
     <w:uiPriority w:val="99"/>
     <w:unhideWhenUsed/>
-    <w:rsid w:val="00D677A3"/>
+    <w:rsid w:val="00C063E0"/>
     <w:pPr>
       <w:tabs>
         <w:tab w:val="center" w:pos="4677"/>
@@ -16045,7 +15952,7 @@
     <w:basedOn w:val="a0"/>
     <w:link w:val="a5"/>
     <w:uiPriority w:val="99"/>
-    <w:rsid w:val="00D677A3"/>
+    <w:rsid w:val="00C063E0"/>
     <w:rPr>
       <w:rFonts w:ascii="Times New Roman" w:eastAsia="Times New Roman" w:hAnsi="Times New Roman" w:cs="Times New Roman"/>
       <w:color w:val="000000"/>
@@ -16058,7 +15965,7 @@
     <w:link w:val="a8"/>
     <w:uiPriority w:val="99"/>
     <w:unhideWhenUsed/>
-    <w:rsid w:val="00D677A3"/>
+    <w:rsid w:val="00C063E0"/>
     <w:pPr>
       <w:tabs>
         <w:tab w:val="center" w:pos="4677"/>
@@ -16072,7 +15979,7 @@
     <w:basedOn w:val="a0"/>
     <w:link w:val="a7"/>
     <w:uiPriority w:val="99"/>
-    <w:rsid w:val="00D677A3"/>
+    <w:rsid w:val="00C063E0"/>
     <w:rPr>
       <w:rFonts w:ascii="Times New Roman" w:eastAsia="Times New Roman" w:hAnsi="Times New Roman" w:cs="Times New Roman"/>
       <w:color w:val="000000"/>

</xml_diff>